<commit_message>
docs: restructure thesis around updated agent runtime
</commit_message>
<xml_diff>
--- a/07.毕业论文修改稿_基于代码重写.docx
+++ b/07.毕业论文修改稿_基于代码重写.docx
@@ -488,7 +488,7 @@
           <w:rFonts w:ascii="Calibri" w:hAnsi="Calibri" w:eastAsia="宋体"/>
           <w:sz w:val="22"/>
         </w:rPr>
-        <w:t>系统采用“LLM + Memory OS + Skill System + Context Builder + Tool Gateway + Safety Guard + Trace/Eval Loop”的运行时架构。后端由FastAPI、文档证据检索、意图解析、结构化命令生成、DAC-3D适配、结果解析、Agent运行时、上下文工程、会话记忆、技能系统、工具网关、安全策略和追踪评测模块组成；前端由React/Vite工作台提供聊天、结构化数据、命令批准、运行状态、记忆补丁和评测结果展示；DAC-3D主系统侧通过PyQt5界面写出状态文件、轮询命令文件并回写执行回执，在不破坏检测算法与主流程边界的前提下实现低侵入式集成。与传统RAG主要面向静态外部文档检索不同，本文Memory OS面向跨轮交互、用户偏好、主题笔记和可审核长期记忆，采用JSON + Markdown存储以及“trace -&gt; memory_patch -&gt; approval -&gt; long_term_memory”的写入闭环。</w:t>
+        <w:t>系统采用“LLM + Goal Store + Context Tree + Memory OS + Skill System + Context Builder + Tool Gateway + API Security + Safety Guard + Trace/Eval Loop”的运行时架构。后端由FastAPI、文档证据检索、意图解析、结构化命令生成、DAC-3D适配、结果解析、Agent运行时、上下文工程、Context Tree、会话记忆、目标跟踪、技能系统、工具网关、API认证授权、安全策略和追踪评测模块组成；前端由React/Vite工作台提供聊天、结构化数据、命令批准、运行状态、目标进度、记忆补丁和评测结果展示；DAC-3D主系统侧通过PyQt5界面写出状态文件、轮询命令文件并回写执行回执，在不破坏检测算法与主流程边界的前提下实现低侵入式集成。与传统RAG主要面向静态外部文档检索不同，本文Memory OS面向跨轮交互、用户偏好、主题笔记和可审核长期记忆，采用JSON + Markdown存储以及“trace -&gt; memory_patch -&gt; approval -&gt; long_term_memory”的写入闭环。</w:t>
       </w:r>
     </w:p>
     <w:p>
@@ -500,7 +500,7 @@
           <w:rFonts w:ascii="Calibri" w:hAnsi="Calibri" w:eastAsia="宋体"/>
           <w:sz w:val="22"/>
         </w:rPr>
-        <w:t>本文基于代码实现对系统进行了功能、接口、安全和回归验证。当前文档证据索引包含7份文档、112个文本分块；Agent运行时注册34个工具、8类本地技能和8个Tool Gateway受控工具；Memory Agent支持最近会话、全局索引、核心记忆、用户偏好、主题知识笔记和记忆补丁审批；本地自动化测试执行153个pytest用例并全部通过；确定性Agent评测覆盖命令预览、确认执行、状态查询、记忆写入和15条安全红队样例，共20个评测用例，全部通过。结果表明，该系统能够把DAC-3D检测软件从单一界面操作扩展为具有上下文工程、可审核记忆、结构化工具调用、安全审批和可追踪验证能力的智能交互原型。受限于本地演示环境，真实硬件长时间联机、多用户权限、生产级鉴权和复杂检测数据泛化仍需在后续工作中继续完善。</w:t>
+        <w:t>本文基于代码实现对系统进行了功能、接口、安全和回归验证。当前文档证据索引包含7份文档、112个文本分块；Agent运行时注册34个工具、7个专业Agent、8类本地技能、5个默认Context Tree节点和8个Tool Gateway受控工具；Memory Agent支持最近会话、全局索引、核心记忆、用户偏好、主题知识笔记和记忆补丁审批；Web API通过ApiActor、角色权限、请求/追踪ID、限流、会话绑定确认token和前端构建资产完整性检查强化边界；本地自动化测试执行178个pytest用例并全部通过；确定性Agent评测覆盖命令预览、确认执行、状态查询、记忆写入和15条安全红队样例，共20个评测用例，全部通过。结果表明，该系统能够把DAC-3D检测软件从单一界面操作扩展为具有上下文工程、可审核记忆、目标跟踪、结构化工具调用、安全审批和可追踪验证能力的智能交互原型。</w:t>
       </w:r>
     </w:p>
     <w:p>
@@ -509,7 +509,7 @@
           <w:rFonts w:ascii="Calibri" w:hAnsi="Calibri" w:eastAsia="宋体"/>
           <w:sz w:val="22"/>
         </w:rPr>
-        <w:t>关键词：大语言模型；Agent运行时；Memory OS；上下文工程；DAC-3D；工具网关；安全审批</w:t>
+        <w:t>关键词：大语言模型；Agent运行时；Memory OS；Context Tree；DAC-3D；工具网关；API安全</w:t>
       </w:r>
     </w:p>
     <w:p>
@@ -564,7 +564,7 @@
           <w:rFonts w:ascii="Times New Roman" w:hAnsi="Times New Roman" w:eastAsia="Times New Roman"/>
           <w:sz w:val="22"/>
         </w:rPr>
-        <w:t>The system is organized as an Agent runtime composed of an LLM, Memory OS, Skill System, Context Builder, Tool Gateway, Safety Guard, and Trace/Eval Loop. The backend integrates FastAPI, document-evidence retrieval, intent parsing, structured command generation, DAC-3D runtime adaptation, result parsing, context engineering, conversation memory, tool gateway, safety policy enforcement, and trace-based evaluation. Unlike traditional RAG, which mainly retrieves static external documents, the Memory OS manages cross-turn continuity, user preferences, topic notes, and auditable long-term memory through a trace-to-patch-to-approval workflow.</w:t>
+        <w:t>The system is organized as an Agent runtime composed of an LLM, Goal Store, Context Tree, Memory OS, Skill System, Context Builder, Tool Gateway, API Security, Safety Guard, and Trace/Eval Loop. The backend integrates FastAPI, document-evidence retrieval, intent parsing, structured command generation, DAC-3D runtime adaptation, result parsing, context engineering, file-backed context nodes, conversation memory, goal tracking, tool gateway, API authentication and authorization, safety policy enforcement, and trace-based evaluation. Unlike traditional RAG, which mainly retrieves static external documents, the Memory OS manages cross-turn continuity, user preferences, topic notes, and auditable long-term memory through a trace-to-patch-to-approval workflow.</w:t>
       </w:r>
     </w:p>
     <w:p>
@@ -576,7 +576,7 @@
           <w:rFonts w:ascii="Times New Roman" w:hAnsi="Times New Roman" w:eastAsia="Times New Roman"/>
           <w:sz w:val="22"/>
         </w:rPr>
-        <w:t>The implementation is evaluated through local tests and deterministic Agent cases. The current document-evidence index contains 7 documents and 112 chunks. The Agent runtime registers 34 tools, 8 local skills, and 8 controlled Tool Gateway tools. The Memory Agent supports recent session memory, global indexed memory, curated MEMORY.md and USER.md files, topic knowledge notes, and memory patch approval. All 153 pytest cases pass, and 20 deterministic Agent evaluation cases, including 15 security red-team cases, also pass. The results show that the proposed system can extend DAC-3D software with context engineering, auditable memory, structured command preview, safety approval, runtime status reading, result explanation, and traceable evaluation.</w:t>
+        <w:t>The implementation is evaluated through local tests and deterministic Agent cases. The current document-evidence index contains 7 documents and 112 chunks. The Agent runtime registers 34 tools, 7 specialist agents, 8 local skills, 5 default Context Tree nodes, and 8 controlled Tool Gateway tools. The Web API adds role-bound API actors, request and trace identifiers, rate limiting, session-bound confirmation tokens, and frontend asset integrity checks. All 178 pytest cases pass, and 20 deterministic Agent evaluation cases, including 15 security red-team cases, also pass. The results show that the proposed system can extend DAC-3D software with context engineering, auditable memory, goal tracking, structured command preview, API security, safety approval, runtime status reading, result explanation, and traceable evaluation.</w:t>
       </w:r>
     </w:p>
     <w:p>
@@ -585,7 +585,7 @@
           <w:rFonts w:ascii="Calibri" w:hAnsi="Calibri" w:eastAsia="宋体"/>
           <w:sz w:val="22"/>
         </w:rPr>
-        <w:t>Key words: Large language model; Agent runtime; Memory OS; Context engineering; DAC-3D; Tool Gateway; safety approval</w:t>
+        <w:t>Key words: Large language model; Agent runtime; Memory OS; Context Tree; DAC-3D; Tool Gateway; API security</w:t>
       </w:r>
     </w:p>
     <w:p>
@@ -740,6 +740,18 @@
     </w:p>
     <w:p>
       <w:pPr>
+        <w:ind w:left="648"/>
+      </w:pPr>
+      <w:r>
+        <w:rPr>
+          <w:rFonts w:ascii="Calibri" w:hAnsi="Calibri" w:eastAsia="宋体"/>
+          <w:sz w:val="22"/>
+        </w:rPr>
+        <w:t>2.7 API安全、会话确认与目标跟踪</w:t>
+      </w:r>
+    </w:p>
+    <w:p>
+      <w:pPr>
         <w:ind w:left="288"/>
       </w:pPr>
       <w:r>
@@ -867,7 +879,7 @@
           <w:rFonts w:ascii="Calibri" w:hAnsi="Calibri" w:eastAsia="宋体"/>
           <w:sz w:val="22"/>
         </w:rPr>
-        <w:t>4.4 核心流程设计</w:t>
+        <w:t>4.4 Agent工作空间与Context Tree设计</w:t>
       </w:r>
     </w:p>
     <w:p>
@@ -879,7 +891,19 @@
           <w:rFonts w:ascii="Calibri" w:hAnsi="Calibri" w:eastAsia="宋体"/>
           <w:sz w:val="22"/>
         </w:rPr>
-        <w:t>4.5 数据结构设计</w:t>
+        <w:t>4.5 核心流程设计</w:t>
+      </w:r>
+    </w:p>
+    <w:p>
+      <w:pPr>
+        <w:ind w:left="648"/>
+      </w:pPr>
+      <w:r>
+        <w:rPr>
+          <w:rFonts w:ascii="Calibri" w:hAnsi="Calibri" w:eastAsia="宋体"/>
+          <w:sz w:val="22"/>
+        </w:rPr>
+        <w:t>4.6 数据结构设计</w:t>
       </w:r>
     </w:p>
     <w:p>
@@ -928,6 +952,18 @@
           <w:sz w:val="22"/>
         </w:rPr>
         <w:t>5.7 Memory OS与Trace/Eval实现</w:t>
+      </w:r>
+    </w:p>
+    <w:p>
+      <w:pPr>
+        <w:ind w:left="648"/>
+      </w:pPr>
+      <w:r>
+        <w:rPr>
+          <w:rFonts w:ascii="Calibri" w:hAnsi="Calibri" w:eastAsia="宋体"/>
+          <w:sz w:val="22"/>
+        </w:rPr>
+        <w:t>5.8 Web API安全、目标工作台与前端实现</w:t>
       </w:r>
     </w:p>
     <w:p>
@@ -1269,7 +1305,7 @@
           <w:rFonts w:ascii="Calibri" w:hAnsi="Calibri" w:eastAsia="宋体"/>
           <w:sz w:val="22"/>
         </w:rPr>
-        <w:t>因此，本文不以提出新的检测算法或训练新的大模型为目标，而是围绕一个本地可运行的DAC-3D智能交互系统展开工程研究。系统贡献主要体现在：把DAC-3D文档、运行状态和检测结果纳入统一上下文；把自然语言操作转换为结构化命令预览；通过Tool Gateway和PolicyEngine对命令进行强制校验；通过Memory OS把会话历史、核心记忆、用户偏好和主题笔记组织为可检索、可审批、可追踪的上下文资产；通过Trace/Eval Loop形成可回归验证的Agent行为记录。</w:t>
+        <w:t>因此，本文不以提出新的检测算法或训练新的大模型为目标，而是围绕一个本地可运行的DAC-3D智能交互系统展开工程研究。系统贡献主要体现在：把DAC-3D文档、运行状态和检测结果纳入统一上下文；把自然语言操作转换为结构化命令预览；通过Tool Gateway和PolicyEngine对命令进行强制校验；通过Memory OS和Context Tree把会话历史、核心记忆、用户偏好、主题笔记和可读工作上下文组织为可检索、可审批、可追踪的上下文资产；通过Goal Store支持Agent工作目标的创建、进度追加和完成记录；通过Trace/Eval Loop形成可回归验证的Agent行为记录。</w:t>
       </w:r>
     </w:p>
     <w:p>
@@ -1373,7 +1409,7 @@
           <w:rFonts w:ascii="Calibri" w:hAnsi="Calibri" w:eastAsia="宋体"/>
           <w:sz w:val="22"/>
         </w:rPr>
-        <w:t>本文主要工作包括以下五项。第一，分析DAC-3D检测业务流程与助手需求，明确问答、状态、结果、操作、记忆和安全边界。第二，设计以DAC-Agent Runtime为核心的系统架构，把文档证据、Agent工具、Memory OS、技能、上下文工程、工具网关和Trace/Eval整合为统一运行时，并明确Memory OS与传统RAG的分工。第三，实现结构化命令生成与安全提交链路，保证命令必须经过预览、校验、确认和桥接提交。第四，实现与DAC-3D主系统的文件桥接，使助手能够读取主系统状态和结果历史，并在确认后提交命令。第五，通过自动化测试和确定性Agent评测验证系统功能、记忆写入流程与安全边界。</w:t>
+        <w:t>本文主要工作包括以下五项。第一，分析DAC-3D检测业务流程与助手需求，明确问答、状态、结果、操作、记忆、目标和安全边界。第二，设计以DAC-Agent Runtime为核心的系统架构，把文档证据、Agent工具、Context Tree、Memory OS、Goal Store、技能、上下文工程、工具网关、API安全和Trace/Eval整合为统一运行时，并明确Memory OS与传统RAG的分工。第三，实现结构化命令生成与安全提交链路，保证命令必须经过预览、会话绑定确认token、校验、确认和桥接提交。第四，实现与DAC-3D主系统的文件桥接，使助手能够读取主系统状态和结果历史，并在确认后提交命令。第五，通过自动化测试和确定性Agent评测验证系统功能、API安全、记忆写入流程与安全边界。</w:t>
       </w:r>
     </w:p>
     <w:p>
@@ -1385,7 +1421,7 @@
           <w:rFonts w:ascii="Calibri" w:hAnsi="Calibri" w:eastAsia="宋体"/>
           <w:sz w:val="22"/>
         </w:rPr>
-        <w:t>按照毕业论文“问题提出—理论基础—需求分析—总体设计—实现验证—总结展望”的写作结构，本文不再按代码文件顺序堆叙模块，而是以研究问题为线索组织内容。第1章回答为什么需要受控DAC-Agent Runtime；第2章说明支撑系统的技术基础以及传统RAG、Memory OS和工具Agent的分工；第3章结合现有代码架构分析系统需求；第4章给出总体分层架构和双路径运行时设计；第5章围绕关键模块说明实现方法；第6章用测试和评测验证功能与安全边界；第7章总结成果并讨论不足。</w:t>
+        <w:t>按照毕业论文“问题提出—理论基础—需求分析—总体设计—实现验证—总结展望”的写作结构，本文不再按代码文件顺序堆叙模块，而是以研究问题为线索组织内容。第1章回答为什么需要受控DAC-Agent Runtime；第2章说明支撑系统的技术基础以及传统RAG、Memory OS、Context Tree、目标跟踪、API安全和工具Agent的分工；第3章结合现有代码架构分析系统需求；第4章给出总体分层架构、双路径运行时和Agent工作空间设计；第5章围绕关键模块说明实现方法；第6章用测试和评测验证功能与安全边界；第7章总结成果并讨论不足。</w:t>
       </w:r>
     </w:p>
     <w:p>
@@ -1638,7 +1674,7 @@
                 <w:rFonts w:ascii="Calibri" w:hAnsi="Calibri" w:eastAsia="宋体"/>
                 <w:sz w:val="20"/>
               </w:rPr>
-              <w:t>RAG、Memory OS、Tool Gateway、Context Builder相关代码</w:t>
+              <w:t>RAG、Memory OS、Context Tree、Goal Store、API Security相关代码</w:t>
             </w:r>
           </w:p>
         </w:tc>
@@ -1712,7 +1748,7 @@
                 <w:rFonts w:ascii="Calibri" w:hAnsi="Calibri" w:eastAsia="宋体"/>
                 <w:sz w:val="20"/>
               </w:rPr>
-              <w:t>app.py、agent_runtime.py、福特科/xxp_ui/window/ui.py</w:t>
+              <w:t>app.py、agent_runtime.py、ui/auth.py、福特科/xxp_ui/window/ui.py</w:t>
             </w:r>
           </w:p>
         </w:tc>
@@ -1786,7 +1822,7 @@
                 <w:rFonts w:ascii="Calibri" w:hAnsi="Calibri" w:eastAsia="宋体"/>
                 <w:sz w:val="20"/>
               </w:rPr>
-              <w:t>ContextBundle、ToolDescriptor、命令生命周期</w:t>
+              <w:t>ContextBundle、Context Tree、ToolDescriptor、命令生命周期</w:t>
             </w:r>
           </w:p>
         </w:tc>
@@ -1860,7 +1896,7 @@
                 <w:rFonts w:ascii="Calibri" w:hAnsi="Calibri" w:eastAsia="宋体"/>
                 <w:sz w:val="20"/>
               </w:rPr>
-              <w:t>memory/、tool_gateway/、safety/、ui/web_api.py</w:t>
+              <w:t>memory/、goals/、tool_gateway/、safety/、ui/web_api.py</w:t>
             </w:r>
           </w:p>
         </w:tc>
@@ -1934,7 +1970,7 @@
                 <w:rFonts w:ascii="Calibri" w:hAnsi="Calibri" w:eastAsia="宋体"/>
                 <w:sz w:val="20"/>
               </w:rPr>
-              <w:t>pytest结果、EvalRunner、安全红队样例</w:t>
+              <w:t>pytest结果、EvalRunner、API安全测试、安全红队样例</w:t>
             </w:r>
           </w:p>
         </w:tc>
@@ -4328,7 +4364,19 @@
           <w:rFonts w:ascii="Calibri" w:hAnsi="Calibri" w:eastAsia="宋体"/>
           <w:sz w:val="22"/>
         </w:rPr>
-        <w:t>Skill System以本地`SKILL.md`目录为单位组织流程知识。当前仓库包含8个技能：命令预览、上下文工程、故障恢复、记忆维护、离线检测、结果解释、安全审批和状态检查。Context Builder则负责按任务选择运行状态、安全策略、技能上下文和记忆上下文，并控制字符预算，避免把完整文档、完整历史或敏感环境变量直接塞入模型上下文。</w:t>
+        <w:t>Skill System以本地`SKILL.md`目录为单位组织流程知识。当前仓库包含8个技能：命令预览、上下文工程、故障恢复、记忆维护、离线检测、结果解释、安全审批和状态检查。Context Tree则以Markdown节点保存可读工作上下文，当前默认包含machine、project、operator、procedure和tool五类节点；它按任务检索相关节点，再由Context Builder与运行状态、安全策略、技能和记忆一起压缩进入本轮上下文。</w:t>
+      </w:r>
+    </w:p>
+    <w:p>
+      <w:pPr>
+        <w:ind w:firstLine="432"/>
+      </w:pPr>
+      <w:r>
+        <w:rPr>
+          <w:rFonts w:ascii="Calibri" w:hAnsi="Calibri" w:eastAsia="宋体"/>
+          <w:sz w:val="22"/>
+        </w:rPr>
+        <w:t>Context Builder负责按任务选择运行状态、安全策略、技能上下文、Context Tree上下文和记忆上下文，并控制字符预算，避免把完整文档、完整历史或敏感环境变量直接塞入模型上下文。由于Context Tree和Memory OS都可能影响模型回答，系统把它们标记为不能授予工具权限、不能取消确认要求的低权限上下文来源。</w:t>
       </w:r>
     </w:p>
     <w:p>
@@ -4340,7 +4388,7 @@
           <w:rFonts w:ascii="Calibri" w:hAnsi="Calibri" w:eastAsia="黑体"/>
           <w:b/>
         </w:rPr>
-        <w:t>2.7 本章小结</w:t>
+        <w:t>2.7 API安全、会话确认与目标跟踪</w:t>
       </w:r>
     </w:p>
     <w:p>
@@ -4352,7 +4400,43 @@
           <w:rFonts w:ascii="Calibri" w:hAnsi="Calibri" w:eastAsia="宋体"/>
           <w:sz w:val="22"/>
         </w:rPr>
-        <w:t>本章介绍了本文系统涉及的大语言模型、上下文工程、文档证据管理、意图解析、Agent工具编排、工具网关、安全策略、记忆和技能。上述技术共同支撑DAC-3D-LLM从“问答助手”升级为“受控Agent运行时”。下一章将从用户、功能、非功能和安全边界角度对系统需求进行分析。</w:t>
+        <w:t>随着Web工作台从演示聊天页面升级为可批准命令、审核记忆、运行评测和管理目标的操作入口，API边界本身成为系统安全的一部分。当前代码通过`ui/auth.py`定义ApiActor、session_id、operator_id和角色集合，区分viewer、operator、admin和security_admin等权限；通过`ui/security_middleware.py`统一生成X-Request-ID和X-Trace-ID，提供结构化错误响应和进程内限流；通过`ui/session.py`把命令确认token绑定到session、operator和命令预览hash。</w:t>
+      </w:r>
+    </w:p>
+    <w:p>
+      <w:pPr>
+        <w:ind w:firstLine="432"/>
+      </w:pPr>
+      <w:r>
+        <w:rPr>
+          <w:rFonts w:ascii="Calibri" w:hAnsi="Calibri" w:eastAsia="宋体"/>
+          <w:sz w:val="22"/>
+        </w:rPr>
+        <w:t>Goal Store是当前main分支新增的Agent工作空间能力。`goals/store.py`使用本地JSON保存目标、状态、进度和完成时间，支持从聊天消息中捕获“目标/goal/objective”类表达，也支持Web API显式创建、追加进度和完成目标。它与Memory OS不同：Memory OS保存偏好和长期上下文，Goal Store保存当前任务目标和执行进度，用于让Agent工作台展示“正在推进什么”和“已经完成了什么”。</w:t>
+      </w:r>
+    </w:p>
+    <w:p>
+      <w:pPr>
+        <w:pStyle w:val="Heading2"/>
+      </w:pPr>
+      <w:r>
+        <w:rPr>
+          <w:rFonts w:ascii="Calibri" w:hAnsi="Calibri" w:eastAsia="黑体"/>
+          <w:b/>
+        </w:rPr>
+        <w:t>2.8 本章小结</w:t>
+      </w:r>
+    </w:p>
+    <w:p>
+      <w:pPr>
+        <w:ind w:firstLine="432"/>
+      </w:pPr>
+      <w:r>
+        <w:rPr>
+          <w:rFonts w:ascii="Calibri" w:hAnsi="Calibri" w:eastAsia="宋体"/>
+          <w:sz w:val="22"/>
+        </w:rPr>
+        <w:t>本章介绍了本文系统涉及的大语言模型、上下文工程、文档证据管理、意图解析、Agent工具编排、工具网关、安全策略、Memory OS、Context Tree、Goal Store、API安全和技能系统。上述技术共同支撑DAC-3D-LLM从“问答助手”升级为“受控Agent运行时”。下一章将结合当前main分支代码，从用户、功能、非功能和安全边界角度对系统需求进行分析。</w:t>
       </w:r>
     </w:p>
     <w:p>
@@ -4778,7 +4862,7 @@
                 <w:rFonts w:ascii="Calibri" w:hAnsi="Calibri" w:eastAsia="宋体"/>
                 <w:sz w:val="20"/>
               </w:rPr>
-              <w:t>memory/</w:t>
+              <w:t>context_engineering/tree.py</w:t>
             </w:r>
           </w:p>
         </w:tc>
@@ -4802,7 +4886,7 @@
                 <w:rFonts w:ascii="Calibri" w:hAnsi="Calibri" w:eastAsia="宋体"/>
                 <w:sz w:val="20"/>
               </w:rPr>
-              <w:t>JSON/Markdown记忆、主题笔记、trace到补丁审批流程</w:t>
+              <w:t>以Markdown节点保存Context Tree并按任务检索</w:t>
             </w:r>
           </w:p>
         </w:tc>
@@ -4826,7 +4910,7 @@
                 <w:rFonts w:ascii="Calibri" w:hAnsi="Calibri" w:eastAsia="宋体"/>
                 <w:sz w:val="20"/>
               </w:rPr>
-              <w:t>第2章Memory OS对比，第5章记忆实现</w:t>
+              <w:t>第2章Context Tree，第4章Agent工作空间设计</w:t>
             </w:r>
           </w:p>
         </w:tc>
@@ -4852,6 +4936,154 @@
                 <w:rFonts w:ascii="Calibri" w:hAnsi="Calibri" w:eastAsia="宋体"/>
                 <w:sz w:val="20"/>
               </w:rPr>
+              <w:t>memory/</w:t>
+            </w:r>
+          </w:p>
+        </w:tc>
+        <w:tc>
+          <w:tcPr>
+            <w:tcW w:type="dxa" w:w="3528"/>
+            <w:vAlign w:val="center"/>
+            <w:tcMar>
+              <w:top w:w="80" w:type="dxa"/>
+              <w:start w:w="120" w:type="dxa"/>
+              <w:bottom w:w="80" w:type="dxa"/>
+              <w:end w:w="120" w:type="dxa"/>
+            </w:tcMar>
+          </w:tcPr>
+          <w:p>
+            <w:pPr>
+              <w:jc w:val="left"/>
+            </w:pPr>
+            <w:r>
+              <w:rPr>
+                <w:rFonts w:ascii="Calibri" w:hAnsi="Calibri" w:eastAsia="宋体"/>
+                <w:sz w:val="20"/>
+              </w:rPr>
+              <w:t>JSON/Markdown记忆、主题笔记、trace到补丁审批流程</w:t>
+            </w:r>
+          </w:p>
+        </w:tc>
+        <w:tc>
+          <w:tcPr>
+            <w:tcW w:type="dxa" w:w="3600"/>
+            <w:vAlign w:val="center"/>
+            <w:tcMar>
+              <w:top w:w="80" w:type="dxa"/>
+              <w:start w:w="120" w:type="dxa"/>
+              <w:bottom w:w="80" w:type="dxa"/>
+              <w:end w:w="120" w:type="dxa"/>
+            </w:tcMar>
+          </w:tcPr>
+          <w:p>
+            <w:pPr>
+              <w:jc w:val="left"/>
+            </w:pPr>
+            <w:r>
+              <w:rPr>
+                <w:rFonts w:ascii="Calibri" w:hAnsi="Calibri" w:eastAsia="宋体"/>
+                <w:sz w:val="20"/>
+              </w:rPr>
+              <w:t>第2章Memory OS对比，第5章记忆实现</w:t>
+            </w:r>
+          </w:p>
+        </w:tc>
+      </w:tr>
+      <w:tr>
+        <w:tc>
+          <w:tcPr>
+            <w:tcW w:type="dxa" w:w="2232"/>
+            <w:vAlign w:val="center"/>
+            <w:tcMar>
+              <w:top w:w="80" w:type="dxa"/>
+              <w:start w:w="120" w:type="dxa"/>
+              <w:bottom w:w="80" w:type="dxa"/>
+              <w:end w:w="120" w:type="dxa"/>
+            </w:tcMar>
+          </w:tcPr>
+          <w:p>
+            <w:pPr>
+              <w:jc w:val="left"/>
+            </w:pPr>
+            <w:r>
+              <w:rPr>
+                <w:rFonts w:ascii="Calibri" w:hAnsi="Calibri" w:eastAsia="宋体"/>
+                <w:sz w:val="20"/>
+              </w:rPr>
+              <w:t>goals/</w:t>
+            </w:r>
+          </w:p>
+        </w:tc>
+        <w:tc>
+          <w:tcPr>
+            <w:tcW w:type="dxa" w:w="3528"/>
+            <w:vAlign w:val="center"/>
+            <w:tcMar>
+              <w:top w:w="80" w:type="dxa"/>
+              <w:start w:w="120" w:type="dxa"/>
+              <w:bottom w:w="80" w:type="dxa"/>
+              <w:end w:w="120" w:type="dxa"/>
+            </w:tcMar>
+          </w:tcPr>
+          <w:p>
+            <w:pPr>
+              <w:jc w:val="left"/>
+            </w:pPr>
+            <w:r>
+              <w:rPr>
+                <w:rFonts w:ascii="Calibri" w:hAnsi="Calibri" w:eastAsia="宋体"/>
+                <w:sz w:val="20"/>
+              </w:rPr>
+              <w:t>本地JSON目标跟踪、进度追加和完成记录</w:t>
+            </w:r>
+          </w:p>
+        </w:tc>
+        <w:tc>
+          <w:tcPr>
+            <w:tcW w:type="dxa" w:w="3600"/>
+            <w:vAlign w:val="center"/>
+            <w:tcMar>
+              <w:top w:w="80" w:type="dxa"/>
+              <w:start w:w="120" w:type="dxa"/>
+              <w:bottom w:w="80" w:type="dxa"/>
+              <w:end w:w="120" w:type="dxa"/>
+            </w:tcMar>
+          </w:tcPr>
+          <w:p>
+            <w:pPr>
+              <w:jc w:val="left"/>
+            </w:pPr>
+            <w:r>
+              <w:rPr>
+                <w:rFonts w:ascii="Calibri" w:hAnsi="Calibri" w:eastAsia="宋体"/>
+                <w:sz w:val="20"/>
+              </w:rPr>
+              <w:t>第2章目标跟踪，第5章Agent工作台实现</w:t>
+            </w:r>
+          </w:p>
+        </w:tc>
+      </w:tr>
+      <w:tr>
+        <w:tc>
+          <w:tcPr>
+            <w:tcW w:type="dxa" w:w="2232"/>
+            <w:vAlign w:val="center"/>
+            <w:tcMar>
+              <w:top w:w="80" w:type="dxa"/>
+              <w:start w:w="120" w:type="dxa"/>
+              <w:bottom w:w="80" w:type="dxa"/>
+              <w:end w:w="120" w:type="dxa"/>
+            </w:tcMar>
+          </w:tcPr>
+          <w:p>
+            <w:pPr>
+              <w:jc w:val="left"/>
+            </w:pPr>
+            <w:r>
+              <w:rPr>
+                <w:rFonts w:ascii="Calibri" w:hAnsi="Calibri" w:eastAsia="宋体"/>
+                <w:sz w:val="20"/>
+              </w:rPr>
               <w:t>tool_gateway/、safety/</w:t>
             </w:r>
           </w:p>
@@ -4901,6 +5133,154 @@
                 <w:sz w:val="20"/>
               </w:rPr>
               <w:t>第3章安全需求，第5章安全实现</w:t>
+            </w:r>
+          </w:p>
+        </w:tc>
+      </w:tr>
+      <w:tr>
+        <w:tc>
+          <w:tcPr>
+            <w:tcW w:type="dxa" w:w="2232"/>
+            <w:vAlign w:val="center"/>
+            <w:tcMar>
+              <w:top w:w="80" w:type="dxa"/>
+              <w:start w:w="120" w:type="dxa"/>
+              <w:bottom w:w="80" w:type="dxa"/>
+              <w:end w:w="120" w:type="dxa"/>
+            </w:tcMar>
+          </w:tcPr>
+          <w:p>
+            <w:pPr>
+              <w:jc w:val="left"/>
+            </w:pPr>
+            <w:r>
+              <w:rPr>
+                <w:rFonts w:ascii="Calibri" w:hAnsi="Calibri" w:eastAsia="宋体"/>
+                <w:sz w:val="20"/>
+              </w:rPr>
+              <w:t>ui/auth.py、ui/session.py</w:t>
+            </w:r>
+          </w:p>
+        </w:tc>
+        <w:tc>
+          <w:tcPr>
+            <w:tcW w:type="dxa" w:w="3528"/>
+            <w:vAlign w:val="center"/>
+            <w:tcMar>
+              <w:top w:w="80" w:type="dxa"/>
+              <w:start w:w="120" w:type="dxa"/>
+              <w:bottom w:w="80" w:type="dxa"/>
+              <w:end w:w="120" w:type="dxa"/>
+            </w:tcMar>
+          </w:tcPr>
+          <w:p>
+            <w:pPr>
+              <w:jc w:val="left"/>
+            </w:pPr>
+            <w:r>
+              <w:rPr>
+                <w:rFonts w:ascii="Calibri" w:hAnsi="Calibri" w:eastAsia="宋体"/>
+                <w:sz w:val="20"/>
+              </w:rPr>
+              <w:t>API Actor、角色权限、会话绑定确认token和预览hash</w:t>
+            </w:r>
+          </w:p>
+        </w:tc>
+        <w:tc>
+          <w:tcPr>
+            <w:tcW w:type="dxa" w:w="3600"/>
+            <w:vAlign w:val="center"/>
+            <w:tcMar>
+              <w:top w:w="80" w:type="dxa"/>
+              <w:start w:w="120" w:type="dxa"/>
+              <w:bottom w:w="80" w:type="dxa"/>
+              <w:end w:w="120" w:type="dxa"/>
+            </w:tcMar>
+          </w:tcPr>
+          <w:p>
+            <w:pPr>
+              <w:jc w:val="left"/>
+            </w:pPr>
+            <w:r>
+              <w:rPr>
+                <w:rFonts w:ascii="Calibri" w:hAnsi="Calibri" w:eastAsia="宋体"/>
+                <w:sz w:val="20"/>
+              </w:rPr>
+              <w:t>第3章API安全需求，第5章Web API安全实现</w:t>
+            </w:r>
+          </w:p>
+        </w:tc>
+      </w:tr>
+      <w:tr>
+        <w:tc>
+          <w:tcPr>
+            <w:tcW w:type="dxa" w:w="2232"/>
+            <w:vAlign w:val="center"/>
+            <w:tcMar>
+              <w:top w:w="80" w:type="dxa"/>
+              <w:start w:w="120" w:type="dxa"/>
+              <w:bottom w:w="80" w:type="dxa"/>
+              <w:end w:w="120" w:type="dxa"/>
+            </w:tcMar>
+          </w:tcPr>
+          <w:p>
+            <w:pPr>
+              <w:jc w:val="left"/>
+            </w:pPr>
+            <w:r>
+              <w:rPr>
+                <w:rFonts w:ascii="Calibri" w:hAnsi="Calibri" w:eastAsia="宋体"/>
+                <w:sz w:val="20"/>
+              </w:rPr>
+              <w:t>ui/security_middleware.py</w:t>
+            </w:r>
+          </w:p>
+        </w:tc>
+        <w:tc>
+          <w:tcPr>
+            <w:tcW w:type="dxa" w:w="3528"/>
+            <w:vAlign w:val="center"/>
+            <w:tcMar>
+              <w:top w:w="80" w:type="dxa"/>
+              <w:start w:w="120" w:type="dxa"/>
+              <w:bottom w:w="80" w:type="dxa"/>
+              <w:end w:w="120" w:type="dxa"/>
+            </w:tcMar>
+          </w:tcPr>
+          <w:p>
+            <w:pPr>
+              <w:jc w:val="left"/>
+            </w:pPr>
+            <w:r>
+              <w:rPr>
+                <w:rFonts w:ascii="Calibri" w:hAnsi="Calibri" w:eastAsia="宋体"/>
+                <w:sz w:val="20"/>
+              </w:rPr>
+              <w:t>请求ID、Trace ID、结构化错误和限流</w:t>
+            </w:r>
+          </w:p>
+        </w:tc>
+        <w:tc>
+          <w:tcPr>
+            <w:tcW w:type="dxa" w:w="3600"/>
+            <w:vAlign w:val="center"/>
+            <w:tcMar>
+              <w:top w:w="80" w:type="dxa"/>
+              <w:start w:w="120" w:type="dxa"/>
+              <w:bottom w:w="80" w:type="dxa"/>
+              <w:end w:w="120" w:type="dxa"/>
+            </w:tcMar>
+          </w:tcPr>
+          <w:p>
+            <w:pPr>
+              <w:jc w:val="left"/>
+            </w:pPr>
+            <w:r>
+              <w:rPr>
+                <w:rFonts w:ascii="Calibri" w:hAnsi="Calibri" w:eastAsia="宋体"/>
+                <w:sz w:val="20"/>
+              </w:rPr>
+              <w:t>第5章API中间件，第6章API安全测试</w:t>
             </w:r>
           </w:p>
         </w:tc>
@@ -6326,7 +6706,7 @@
                 <w:rFonts w:ascii="Calibri" w:hAnsi="Calibri" w:eastAsia="宋体"/>
                 <w:sz w:val="20"/>
               </w:rPr>
-              <w:t>Trace/Eval</w:t>
+              <w:t>Context Tree与目标跟踪</w:t>
             </w:r>
           </w:p>
         </w:tc>
@@ -6350,7 +6730,7 @@
                 <w:rFonts w:ascii="Calibri" w:hAnsi="Calibri" w:eastAsia="宋体"/>
                 <w:sz w:val="20"/>
               </w:rPr>
-              <w:t>记录Agent行为、生成评测草稿并运行本地确定性评测。</w:t>
+              <w:t>支持可读工作上下文检索、Agent目标创建、进度追加和完成记录。</w:t>
             </w:r>
           </w:p>
         </w:tc>
@@ -6400,7 +6780,7 @@
                 <w:rFonts w:ascii="Calibri" w:hAnsi="Calibri" w:eastAsia="宋体"/>
                 <w:sz w:val="20"/>
               </w:rPr>
-              <w:t>前后端交互</w:t>
+              <w:t>Trace/Eval</w:t>
             </w:r>
           </w:p>
         </w:tc>
@@ -6424,7 +6804,7 @@
                 <w:rFonts w:ascii="Calibri" w:hAnsi="Calibri" w:eastAsia="宋体"/>
                 <w:sz w:val="20"/>
               </w:rPr>
-              <w:t>提供FastAPI接口、React工作台、流式聊天、命令批准、记忆审批和评测展示。</w:t>
+              <w:t>记录Agent行为、生成评测草稿并运行本地确定性评测。</w:t>
             </w:r>
           </w:p>
         </w:tc>
@@ -6451,6 +6831,154 @@
                 <w:sz w:val="20"/>
               </w:rPr>
               <w:t>F10</w:t>
+            </w:r>
+          </w:p>
+        </w:tc>
+        <w:tc>
+          <w:tcPr>
+            <w:tcW w:type="dxa" w:w="2232"/>
+            <w:vAlign w:val="center"/>
+            <w:tcMar>
+              <w:top w:w="80" w:type="dxa"/>
+              <w:start w:w="120" w:type="dxa"/>
+              <w:bottom w:w="80" w:type="dxa"/>
+              <w:end w:w="120" w:type="dxa"/>
+            </w:tcMar>
+          </w:tcPr>
+          <w:p>
+            <w:pPr>
+              <w:jc w:val="left"/>
+            </w:pPr>
+            <w:r>
+              <w:rPr>
+                <w:rFonts w:ascii="Calibri" w:hAnsi="Calibri" w:eastAsia="宋体"/>
+                <w:sz w:val="20"/>
+              </w:rPr>
+              <w:t>API安全</w:t>
+            </w:r>
+          </w:p>
+        </w:tc>
+        <w:tc>
+          <w:tcPr>
+            <w:tcW w:type="dxa" w:w="6263"/>
+            <w:vAlign w:val="center"/>
+            <w:tcMar>
+              <w:top w:w="80" w:type="dxa"/>
+              <w:start w:w="120" w:type="dxa"/>
+              <w:bottom w:w="80" w:type="dxa"/>
+              <w:end w:w="120" w:type="dxa"/>
+            </w:tcMar>
+          </w:tcPr>
+          <w:p>
+            <w:pPr>
+              <w:jc w:val="left"/>
+            </w:pPr>
+            <w:r>
+              <w:rPr>
+                <w:rFonts w:ascii="Calibri" w:hAnsi="Calibri" w:eastAsia="宋体"/>
+                <w:sz w:val="20"/>
+              </w:rPr>
+              <w:t>对读写接口执行session、operator、role、确认token和请求追踪校验。</w:t>
+            </w:r>
+          </w:p>
+        </w:tc>
+      </w:tr>
+      <w:tr>
+        <w:tc>
+          <w:tcPr>
+            <w:tcW w:type="dxa" w:w="864"/>
+            <w:vAlign w:val="center"/>
+            <w:tcMar>
+              <w:top w:w="80" w:type="dxa"/>
+              <w:start w:w="120" w:type="dxa"/>
+              <w:bottom w:w="80" w:type="dxa"/>
+              <w:end w:w="120" w:type="dxa"/>
+            </w:tcMar>
+          </w:tcPr>
+          <w:p>
+            <w:pPr>
+              <w:jc w:val="left"/>
+            </w:pPr>
+            <w:r>
+              <w:rPr>
+                <w:rFonts w:ascii="Calibri" w:hAnsi="Calibri" w:eastAsia="宋体"/>
+                <w:sz w:val="20"/>
+              </w:rPr>
+              <w:t>F11</w:t>
+            </w:r>
+          </w:p>
+        </w:tc>
+        <w:tc>
+          <w:tcPr>
+            <w:tcW w:type="dxa" w:w="2232"/>
+            <w:vAlign w:val="center"/>
+            <w:tcMar>
+              <w:top w:w="80" w:type="dxa"/>
+              <w:start w:w="120" w:type="dxa"/>
+              <w:bottom w:w="80" w:type="dxa"/>
+              <w:end w:w="120" w:type="dxa"/>
+            </w:tcMar>
+          </w:tcPr>
+          <w:p>
+            <w:pPr>
+              <w:jc w:val="left"/>
+            </w:pPr>
+            <w:r>
+              <w:rPr>
+                <w:rFonts w:ascii="Calibri" w:hAnsi="Calibri" w:eastAsia="宋体"/>
+                <w:sz w:val="20"/>
+              </w:rPr>
+              <w:t>前后端交互</w:t>
+            </w:r>
+          </w:p>
+        </w:tc>
+        <w:tc>
+          <w:tcPr>
+            <w:tcW w:type="dxa" w:w="6263"/>
+            <w:vAlign w:val="center"/>
+            <w:tcMar>
+              <w:top w:w="80" w:type="dxa"/>
+              <w:start w:w="120" w:type="dxa"/>
+              <w:bottom w:w="80" w:type="dxa"/>
+              <w:end w:w="120" w:type="dxa"/>
+            </w:tcMar>
+          </w:tcPr>
+          <w:p>
+            <w:pPr>
+              <w:jc w:val="left"/>
+            </w:pPr>
+            <w:r>
+              <w:rPr>
+                <w:rFonts w:ascii="Calibri" w:hAnsi="Calibri" w:eastAsia="宋体"/>
+                <w:sz w:val="20"/>
+              </w:rPr>
+              <w:t>提供FastAPI接口、React工作台、流式聊天、命令批准、记忆审批、目标管理和评测展示。</w:t>
+            </w:r>
+          </w:p>
+        </w:tc>
+      </w:tr>
+      <w:tr>
+        <w:tc>
+          <w:tcPr>
+            <w:tcW w:type="dxa" w:w="864"/>
+            <w:vAlign w:val="center"/>
+            <w:tcMar>
+              <w:top w:w="80" w:type="dxa"/>
+              <w:start w:w="120" w:type="dxa"/>
+              <w:bottom w:w="80" w:type="dxa"/>
+              <w:end w:w="120" w:type="dxa"/>
+            </w:tcMar>
+          </w:tcPr>
+          <w:p>
+            <w:pPr>
+              <w:jc w:val="left"/>
+            </w:pPr>
+            <w:r>
+              <w:rPr>
+                <w:rFonts w:ascii="Calibri" w:hAnsi="Calibri" w:eastAsia="宋体"/>
+                <w:sz w:val="20"/>
+              </w:rPr>
+              <w:t>F12</w:t>
             </w:r>
           </w:p>
         </w:tc>
@@ -7015,6 +7543,80 @@
                 <w:rFonts w:ascii="Calibri" w:hAnsi="Calibri" w:eastAsia="宋体"/>
                 <w:sz w:val="20"/>
               </w:rPr>
+              <w:t>接口安全</w:t>
+            </w:r>
+          </w:p>
+        </w:tc>
+        <w:tc>
+          <w:tcPr>
+            <w:tcW w:type="dxa" w:w="3384"/>
+            <w:vAlign w:val="center"/>
+            <w:tcMar>
+              <w:top w:w="80" w:type="dxa"/>
+              <w:start w:w="120" w:type="dxa"/>
+              <w:bottom w:w="80" w:type="dxa"/>
+              <w:end w:w="120" w:type="dxa"/>
+            </w:tcMar>
+          </w:tcPr>
+          <w:p>
+            <w:pPr>
+              <w:jc w:val="left"/>
+            </w:pPr>
+            <w:r>
+              <w:rPr>
+                <w:rFonts w:ascii="Calibri" w:hAnsi="Calibri" w:eastAsia="宋体"/>
+                <w:sz w:val="20"/>
+              </w:rPr>
+              <w:t>Web接口要避免无身份写入、越权审批、确认token重放和错误泄漏。</w:t>
+            </w:r>
+          </w:p>
+        </w:tc>
+        <w:tc>
+          <w:tcPr>
+            <w:tcW w:type="dxa" w:w="4248"/>
+            <w:vAlign w:val="center"/>
+            <w:tcMar>
+              <w:top w:w="80" w:type="dxa"/>
+              <w:start w:w="120" w:type="dxa"/>
+              <w:bottom w:w="80" w:type="dxa"/>
+              <w:end w:w="120" w:type="dxa"/>
+            </w:tcMar>
+          </w:tcPr>
+          <w:p>
+            <w:pPr>
+              <w:jc w:val="left"/>
+            </w:pPr>
+            <w:r>
+              <w:rPr>
+                <w:rFonts w:ascii="Calibri" w:hAnsi="Calibri" w:eastAsia="宋体"/>
+                <w:sz w:val="20"/>
+              </w:rPr>
+              <w:t>ApiActor、角色权限、ConfirmationTokenStore、结构化错误和API安全测试覆盖。</w:t>
+            </w:r>
+          </w:p>
+        </w:tc>
+      </w:tr>
+      <w:tr>
+        <w:tc>
+          <w:tcPr>
+            <w:tcW w:type="dxa" w:w="1728"/>
+            <w:vAlign w:val="center"/>
+            <w:tcMar>
+              <w:top w:w="80" w:type="dxa"/>
+              <w:start w:w="120" w:type="dxa"/>
+              <w:bottom w:w="80" w:type="dxa"/>
+              <w:end w:w="120" w:type="dxa"/>
+            </w:tcMar>
+          </w:tcPr>
+          <w:p>
+            <w:pPr>
+              <w:jc w:val="left"/>
+            </w:pPr>
+            <w:r>
+              <w:rPr>
+                <w:rFonts w:ascii="Calibri" w:hAnsi="Calibri" w:eastAsia="宋体"/>
+                <w:sz w:val="20"/>
+              </w:rPr>
               <w:t>可配置性</w:t>
             </w:r>
           </w:p>
@@ -7166,6 +7768,34 @@
     </w:p>
     <w:p>
       <w:pPr>
+        <w:pStyle w:val="ListNumber"/>
+        <w:spacing w:after="80" w:line="290" w:lineRule="auto"/>
+        <w:ind w:left="540" w:hanging="279"/>
+      </w:pPr>
+      <w:r>
+        <w:rPr>
+          <w:rFonts w:ascii="Calibri" w:hAnsi="Calibri" w:eastAsia="宋体"/>
+          <w:sz w:val="22"/>
+        </w:rPr>
+        <w:t>Web写接口必须绑定session_id、operator_id和角色权限，命令确认token必须绑定预览hash并防止重放。</w:t>
+      </w:r>
+    </w:p>
+    <w:p>
+      <w:pPr>
+        <w:pStyle w:val="ListNumber"/>
+        <w:spacing w:after="80" w:line="290" w:lineRule="auto"/>
+        <w:ind w:left="540" w:hanging="279"/>
+      </w:pPr>
+      <w:r>
+        <w:rPr>
+          <w:rFonts w:ascii="Calibri" w:hAnsi="Calibri" w:eastAsia="宋体"/>
+          <w:sz w:val="22"/>
+        </w:rPr>
+        <w:t>前端静态资源只在构建产物完整且路径位于dist目录内时提供，缺失资产时应回退到构建提示页。</w:t>
+      </w:r>
+    </w:p>
+    <w:p>
+      <w:pPr>
         <w:pStyle w:val="Heading2"/>
       </w:pPr>
       <w:r>
@@ -7316,7 +7946,7 @@
           <w:rFonts w:ascii="Calibri" w:hAnsi="Calibri" w:eastAsia="宋体"/>
           <w:sz w:val="22"/>
         </w:rPr>
-        <w:t>系统总体架构由九个层次组成：配置与运行环境层、文档证据与上下文层、意图与结构化命令层、DAC-3D适配与结果解析层、Agent运行时层、上下文工程层、记忆与技能层、工具网关与安全层、Web/API/主系统桥接层。各层之间通过明确的数据结构和函数接口连接。</w:t>
+        <w:t>系统总体架构由十一个层次组成：配置与运行环境层、文档证据与上下文层、意图与结构化命令层、DAC-3D适配与结果解析层、Agent运行时层、Context Tree与Goal Store层、Memory OS与技能层、上下文工程层、工具网关与安全层、API认证授权层、Web/API/主系统桥接层。各层之间通过明确的数据结构和函数接口连接。</w:t>
       </w:r>
     </w:p>
     <w:p>
@@ -7365,7 +7995,31 @@
           <w:rFonts w:ascii="Consolas" w:hAnsi="Consolas" w:eastAsia="等线"/>
           <w:sz w:val="18"/>
         </w:rPr>
-        <w:t xml:space="preserve">  -&gt; ContextBuilder选择状态、记忆、技能和安全策略</w:t>
+        <w:t xml:space="preserve">  -&gt; API Actor校验session/operator/role</w:t>
+      </w:r>
+    </w:p>
+    <w:p>
+      <w:pPr>
+        <w:pStyle w:val="CodeBlock"/>
+      </w:pPr>
+      <w:r>
+        <w:rPr>
+          <w:rFonts w:ascii="Consolas" w:hAnsi="Consolas" w:eastAsia="等线"/>
+          <w:sz w:val="18"/>
+        </w:rPr>
+        <w:t xml:space="preserve">  -&gt; Goal Store / Context Tree / Memory OS预取</w:t>
+      </w:r>
+    </w:p>
+    <w:p>
+      <w:pPr>
+        <w:pStyle w:val="CodeBlock"/>
+      </w:pPr>
+      <w:r>
+        <w:rPr>
+          <w:rFonts w:ascii="Consolas" w:hAnsi="Consolas" w:eastAsia="等线"/>
+          <w:sz w:val="18"/>
+        </w:rPr>
+        <w:t xml:space="preserve">  -&gt; ContextBuilder选择状态、目标、Context Tree、记忆、技能和安全策略</w:t>
       </w:r>
     </w:p>
     <w:p>
@@ -8012,7 +8666,7 @@
                 <w:rFonts w:ascii="Calibri" w:hAnsi="Calibri" w:eastAsia="宋体"/>
                 <w:sz w:val="20"/>
               </w:rPr>
-              <w:t>上下文工程</w:t>
+              <w:t>Context Tree</w:t>
             </w:r>
           </w:p>
         </w:tc>
@@ -8036,7 +8690,7 @@
                 <w:rFonts w:ascii="Calibri" w:hAnsi="Calibri" w:eastAsia="宋体"/>
                 <w:sz w:val="20"/>
               </w:rPr>
-              <w:t>context_engineering/builder.py</w:t>
+              <w:t>context_engineering/tree.py</w:t>
             </w:r>
           </w:p>
         </w:tc>
@@ -8060,7 +8714,7 @@
                 <w:rFonts w:ascii="Calibri" w:hAnsi="Calibri" w:eastAsia="宋体"/>
                 <w:sz w:val="20"/>
               </w:rPr>
-              <w:t>选择、压缩、隔离状态、记忆、技能和安全策略</w:t>
+              <w:t>以Markdown节点保存工作上下文并按任务检索</w:t>
             </w:r>
           </w:p>
         </w:tc>
@@ -8086,7 +8740,7 @@
                 <w:rFonts w:ascii="Calibri" w:hAnsi="Calibri" w:eastAsia="宋体"/>
                 <w:sz w:val="20"/>
               </w:rPr>
-              <w:t>记忆系统</w:t>
+              <w:t>上下文工程</w:t>
             </w:r>
           </w:p>
         </w:tc>
@@ -8110,7 +8764,7 @@
                 <w:rFonts w:ascii="Calibri" w:hAnsi="Calibri" w:eastAsia="宋体"/>
                 <w:sz w:val="20"/>
               </w:rPr>
-              <w:t>memory/</w:t>
+              <w:t>context_engineering/builder.py</w:t>
             </w:r>
           </w:p>
         </w:tc>
@@ -8134,7 +8788,7 @@
                 <w:rFonts w:ascii="Calibri" w:hAnsi="Calibri" w:eastAsia="宋体"/>
                 <w:sz w:val="20"/>
               </w:rPr>
-              <w:t>保存会话JSON、长期索引、知识笔记和记忆补丁</w:t>
+              <w:t>选择、压缩、隔离状态、Context Tree、记忆、技能和安全策略</w:t>
             </w:r>
           </w:p>
         </w:tc>
@@ -8160,7 +8814,7 @@
                 <w:rFonts w:ascii="Calibri" w:hAnsi="Calibri" w:eastAsia="宋体"/>
                 <w:sz w:val="20"/>
               </w:rPr>
-              <w:t>技能系统</w:t>
+              <w:t>记忆系统</w:t>
             </w:r>
           </w:p>
         </w:tc>
@@ -8184,7 +8838,7 @@
                 <w:rFonts w:ascii="Calibri" w:hAnsi="Calibri" w:eastAsia="宋体"/>
                 <w:sz w:val="20"/>
               </w:rPr>
-              <w:t>skill_system/、skills/</w:t>
+              <w:t>memory/</w:t>
             </w:r>
           </w:p>
         </w:tc>
@@ -8208,7 +8862,7 @@
                 <w:rFonts w:ascii="Calibri" w:hAnsi="Calibri" w:eastAsia="宋体"/>
                 <w:sz w:val="20"/>
               </w:rPr>
-              <w:t>发现、选择和读取本地AgentSkills工作流</w:t>
+              <w:t>保存会话JSON、长期索引、知识笔记和记忆补丁</w:t>
             </w:r>
           </w:p>
         </w:tc>
@@ -8234,7 +8888,7 @@
                 <w:rFonts w:ascii="Calibri" w:hAnsi="Calibri" w:eastAsia="宋体"/>
                 <w:sz w:val="20"/>
               </w:rPr>
-              <w:t>工具网关与安全</w:t>
+              <w:t>目标跟踪</w:t>
             </w:r>
           </w:p>
         </w:tc>
@@ -8258,7 +8912,7 @@
                 <w:rFonts w:ascii="Calibri" w:hAnsi="Calibri" w:eastAsia="宋体"/>
                 <w:sz w:val="20"/>
               </w:rPr>
-              <w:t>tool_gateway/、safety/</w:t>
+              <w:t>goals/</w:t>
             </w:r>
           </w:p>
         </w:tc>
@@ -8282,7 +8936,7 @@
                 <w:rFonts w:ascii="Calibri" w:hAnsi="Calibri" w:eastAsia="宋体"/>
                 <w:sz w:val="20"/>
               </w:rPr>
-              <w:t>统一工具边界、风险分类、白名单、确认和策略校验</w:t>
+              <w:t>创建Agent目标、追加进度、完成目标并展示到工作台</w:t>
             </w:r>
           </w:p>
         </w:tc>
@@ -8308,6 +8962,228 @@
                 <w:rFonts w:ascii="Calibri" w:hAnsi="Calibri" w:eastAsia="宋体"/>
                 <w:sz w:val="20"/>
               </w:rPr>
+              <w:t>技能系统</w:t>
+            </w:r>
+          </w:p>
+        </w:tc>
+        <w:tc>
+          <w:tcPr>
+            <w:tcW w:type="dxa" w:w="3168"/>
+            <w:vAlign w:val="center"/>
+            <w:tcMar>
+              <w:top w:w="80" w:type="dxa"/>
+              <w:start w:w="120" w:type="dxa"/>
+              <w:bottom w:w="80" w:type="dxa"/>
+              <w:end w:w="120" w:type="dxa"/>
+            </w:tcMar>
+          </w:tcPr>
+          <w:p>
+            <w:pPr>
+              <w:jc w:val="left"/>
+            </w:pPr>
+            <w:r>
+              <w:rPr>
+                <w:rFonts w:ascii="Calibri" w:hAnsi="Calibri" w:eastAsia="宋体"/>
+                <w:sz w:val="20"/>
+              </w:rPr>
+              <w:t>skill_system/、skills/</w:t>
+            </w:r>
+          </w:p>
+        </w:tc>
+        <w:tc>
+          <w:tcPr>
+            <w:tcW w:type="dxa" w:w="4392"/>
+            <w:vAlign w:val="center"/>
+            <w:tcMar>
+              <w:top w:w="80" w:type="dxa"/>
+              <w:start w:w="120" w:type="dxa"/>
+              <w:bottom w:w="80" w:type="dxa"/>
+              <w:end w:w="120" w:type="dxa"/>
+            </w:tcMar>
+          </w:tcPr>
+          <w:p>
+            <w:pPr>
+              <w:jc w:val="left"/>
+            </w:pPr>
+            <w:r>
+              <w:rPr>
+                <w:rFonts w:ascii="Calibri" w:hAnsi="Calibri" w:eastAsia="宋体"/>
+                <w:sz w:val="20"/>
+              </w:rPr>
+              <w:t>发现、选择和读取本地AgentSkills工作流</w:t>
+            </w:r>
+          </w:p>
+        </w:tc>
+      </w:tr>
+      <w:tr>
+        <w:tc>
+          <w:tcPr>
+            <w:tcW w:type="dxa" w:w="1800"/>
+            <w:vAlign w:val="center"/>
+            <w:tcMar>
+              <w:top w:w="80" w:type="dxa"/>
+              <w:start w:w="120" w:type="dxa"/>
+              <w:bottom w:w="80" w:type="dxa"/>
+              <w:end w:w="120" w:type="dxa"/>
+            </w:tcMar>
+          </w:tcPr>
+          <w:p>
+            <w:pPr>
+              <w:jc w:val="left"/>
+            </w:pPr>
+            <w:r>
+              <w:rPr>
+                <w:rFonts w:ascii="Calibri" w:hAnsi="Calibri" w:eastAsia="宋体"/>
+                <w:sz w:val="20"/>
+              </w:rPr>
+              <w:t>工具网关与安全</w:t>
+            </w:r>
+          </w:p>
+        </w:tc>
+        <w:tc>
+          <w:tcPr>
+            <w:tcW w:type="dxa" w:w="3168"/>
+            <w:vAlign w:val="center"/>
+            <w:tcMar>
+              <w:top w:w="80" w:type="dxa"/>
+              <w:start w:w="120" w:type="dxa"/>
+              <w:bottom w:w="80" w:type="dxa"/>
+              <w:end w:w="120" w:type="dxa"/>
+            </w:tcMar>
+          </w:tcPr>
+          <w:p>
+            <w:pPr>
+              <w:jc w:val="left"/>
+            </w:pPr>
+            <w:r>
+              <w:rPr>
+                <w:rFonts w:ascii="Calibri" w:hAnsi="Calibri" w:eastAsia="宋体"/>
+                <w:sz w:val="20"/>
+              </w:rPr>
+              <w:t>tool_gateway/、safety/</w:t>
+            </w:r>
+          </w:p>
+        </w:tc>
+        <w:tc>
+          <w:tcPr>
+            <w:tcW w:type="dxa" w:w="4392"/>
+            <w:vAlign w:val="center"/>
+            <w:tcMar>
+              <w:top w:w="80" w:type="dxa"/>
+              <w:start w:w="120" w:type="dxa"/>
+              <w:bottom w:w="80" w:type="dxa"/>
+              <w:end w:w="120" w:type="dxa"/>
+            </w:tcMar>
+          </w:tcPr>
+          <w:p>
+            <w:pPr>
+              <w:jc w:val="left"/>
+            </w:pPr>
+            <w:r>
+              <w:rPr>
+                <w:rFonts w:ascii="Calibri" w:hAnsi="Calibri" w:eastAsia="宋体"/>
+                <w:sz w:val="20"/>
+              </w:rPr>
+              <w:t>统一工具边界、风险分类、白名单、确认和策略校验</w:t>
+            </w:r>
+          </w:p>
+        </w:tc>
+      </w:tr>
+      <w:tr>
+        <w:tc>
+          <w:tcPr>
+            <w:tcW w:type="dxa" w:w="1800"/>
+            <w:vAlign w:val="center"/>
+            <w:tcMar>
+              <w:top w:w="80" w:type="dxa"/>
+              <w:start w:w="120" w:type="dxa"/>
+              <w:bottom w:w="80" w:type="dxa"/>
+              <w:end w:w="120" w:type="dxa"/>
+            </w:tcMar>
+          </w:tcPr>
+          <w:p>
+            <w:pPr>
+              <w:jc w:val="left"/>
+            </w:pPr>
+            <w:r>
+              <w:rPr>
+                <w:rFonts w:ascii="Calibri" w:hAnsi="Calibri" w:eastAsia="宋体"/>
+                <w:sz w:val="20"/>
+              </w:rPr>
+              <w:t>API安全</w:t>
+            </w:r>
+          </w:p>
+        </w:tc>
+        <w:tc>
+          <w:tcPr>
+            <w:tcW w:type="dxa" w:w="3168"/>
+            <w:vAlign w:val="center"/>
+            <w:tcMar>
+              <w:top w:w="80" w:type="dxa"/>
+              <w:start w:w="120" w:type="dxa"/>
+              <w:bottom w:w="80" w:type="dxa"/>
+              <w:end w:w="120" w:type="dxa"/>
+            </w:tcMar>
+          </w:tcPr>
+          <w:p>
+            <w:pPr>
+              <w:jc w:val="left"/>
+            </w:pPr>
+            <w:r>
+              <w:rPr>
+                <w:rFonts w:ascii="Calibri" w:hAnsi="Calibri" w:eastAsia="宋体"/>
+                <w:sz w:val="20"/>
+              </w:rPr>
+              <w:t>ui/auth.py、ui/session.py、ui/security_middleware.py</w:t>
+            </w:r>
+          </w:p>
+        </w:tc>
+        <w:tc>
+          <w:tcPr>
+            <w:tcW w:type="dxa" w:w="4392"/>
+            <w:vAlign w:val="center"/>
+            <w:tcMar>
+              <w:top w:w="80" w:type="dxa"/>
+              <w:start w:w="120" w:type="dxa"/>
+              <w:bottom w:w="80" w:type="dxa"/>
+              <w:end w:w="120" w:type="dxa"/>
+            </w:tcMar>
+          </w:tcPr>
+          <w:p>
+            <w:pPr>
+              <w:jc w:val="left"/>
+            </w:pPr>
+            <w:r>
+              <w:rPr>
+                <w:rFonts w:ascii="Calibri" w:hAnsi="Calibri" w:eastAsia="宋体"/>
+                <w:sz w:val="20"/>
+              </w:rPr>
+              <w:t>校验角色、会话、确认token、请求追踪和限流</w:t>
+            </w:r>
+          </w:p>
+        </w:tc>
+      </w:tr>
+      <w:tr>
+        <w:tc>
+          <w:tcPr>
+            <w:tcW w:type="dxa" w:w="1800"/>
+            <w:vAlign w:val="center"/>
+            <w:tcMar>
+              <w:top w:w="80" w:type="dxa"/>
+              <w:start w:w="120" w:type="dxa"/>
+              <w:bottom w:w="80" w:type="dxa"/>
+              <w:end w:w="120" w:type="dxa"/>
+            </w:tcMar>
+          </w:tcPr>
+          <w:p>
+            <w:pPr>
+              <w:jc w:val="left"/>
+            </w:pPr>
+            <w:r>
+              <w:rPr>
+                <w:rFonts w:ascii="Calibri" w:hAnsi="Calibri" w:eastAsia="宋体"/>
+                <w:sz w:val="20"/>
+              </w:rPr>
               <w:t>Web API</w:t>
             </w:r>
           </w:p>
@@ -8356,7 +9232,7 @@
                 <w:rFonts w:ascii="Calibri" w:hAnsi="Calibri" w:eastAsia="宋体"/>
                 <w:sz w:val="20"/>
               </w:rPr>
-              <w:t>提供聊天、流式聊天、命令批准、评测和记忆审批接口</w:t>
+              <w:t>提供聊天、流式聊天、命令批准、目标管理、评测和记忆审批接口</w:t>
             </w:r>
           </w:p>
         </w:tc>
@@ -8986,19 +9862,756 @@
           <w:rFonts w:ascii="Calibri" w:hAnsi="Calibri" w:eastAsia="黑体"/>
           <w:b/>
         </w:rPr>
-        <w:t>4.4 核心流程设计</w:t>
+        <w:t>4.4 Agent工作空间与Context Tree设计</w:t>
       </w:r>
     </w:p>
     <w:p>
       <w:pPr>
-        <w:pStyle w:val="Heading3"/>
+        <w:ind w:firstLine="432"/>
+      </w:pPr>
+      <w:r>
+        <w:rPr>
+          <w:rFonts w:ascii="Calibri" w:hAnsi="Calibri" w:eastAsia="宋体"/>
+          <w:sz w:val="22"/>
+        </w:rPr>
+        <w:t>当前main分支新增了Agent工作空间视图，其核心工作流为user_task -&gt; goal_tracking -&gt; coordinator_route -&gt; skill_selection -&gt; context_tree_search -&gt; memory_prefetch -&gt; specialist_agent -&gt; tool_loop -&gt; trace_feedback。该流程把“用户提出任务”到“Agent执行并留下证据”的过程拆成可展示、可审计的阶段，使论文中的Agent Runtime不再只是后端调度器，而是一个可观察的工作空间。</w:t>
+      </w:r>
+    </w:p>
+    <w:p>
+      <w:pPr>
+        <w:ind w:firstLine="432"/>
+      </w:pPr>
+      <w:r>
+        <w:rPr>
+          <w:rFonts w:ascii="Calibri" w:hAnsi="Calibri" w:eastAsia="宋体"/>
+          <w:sz w:val="22"/>
+        </w:rPr>
+        <w:t>Context Tree采用文件化Markdown节点保存稳定工作上下文，默认包含DAC运行状态、项目上下文、操作员工作流偏好、离线检测流程和工具路由说明五类节点。与Memory OS相比，Context Tree更像人工可读的工作手册和项目上下文；与文档证据层相比，它更轻量、更靠近Agent运行时，每轮任务可以检索相关节点并作为低权限上下文注入。</w:t>
+      </w:r>
+    </w:p>
+    <w:p>
+      <w:pPr>
+        <w:pStyle w:val="ThesisCaption"/>
+      </w:pPr>
+      <w:r>
+        <w:rPr>
+          <w:rFonts w:ascii="Calibri" w:hAnsi="Calibri" w:eastAsia="宋体"/>
+          <w:color w:val="555555"/>
+          <w:sz w:val="20"/>
+        </w:rPr>
+        <w:t>表4-3 Agent工作空间运行阶段</w:t>
+      </w:r>
+    </w:p>
+    <w:tbl>
+      <w:tblPr>
+        <w:tblStyle w:val="TableGrid"/>
+        <w:tblW w:type="dxa" w:w="9360"/>
+        <w:tblLayout w:type="fixed"/>
+        <w:tblLook w:firstColumn="1" w:firstRow="1" w:lastColumn="0" w:lastRow="0" w:noHBand="0" w:noVBand="1" w:val="04A0"/>
+        <w:jc w:val="center"/>
+        <w:tblInd w:type="dxa" w:w="120"/>
+      </w:tblPr>
+      <w:tblGrid>
+        <w:gridCol w:w="2304"/>
+        <w:gridCol w:w="3528"/>
+        <w:gridCol w:w="3528"/>
+      </w:tblGrid>
+      <w:tr>
+        <w:tc>
+          <w:tcPr>
+            <w:tcW w:type="dxa" w:w="2304"/>
+            <w:vAlign w:val="center"/>
+            <w:tcMar>
+              <w:top w:w="80" w:type="dxa"/>
+              <w:start w:w="120" w:type="dxa"/>
+              <w:bottom w:w="80" w:type="dxa"/>
+              <w:end w:w="120" w:type="dxa"/>
+            </w:tcMar>
+            <w:shd w:fill="F4F6F9"/>
+          </w:tcPr>
+          <w:p>
+            <w:pPr>
+              <w:jc w:val="center"/>
+            </w:pPr>
+            <w:r>
+              <w:rPr>
+                <w:rFonts w:ascii="Calibri" w:hAnsi="Calibri" w:eastAsia="黑体"/>
+                <w:b/>
+                <w:sz w:val="20"/>
+              </w:rPr>
+              <w:t>阶段</w:t>
+            </w:r>
+          </w:p>
+        </w:tc>
+        <w:tc>
+          <w:tcPr>
+            <w:tcW w:type="dxa" w:w="3528"/>
+            <w:vAlign w:val="center"/>
+            <w:tcMar>
+              <w:top w:w="80" w:type="dxa"/>
+              <w:start w:w="120" w:type="dxa"/>
+              <w:bottom w:w="80" w:type="dxa"/>
+              <w:end w:w="120" w:type="dxa"/>
+            </w:tcMar>
+            <w:shd w:fill="F4F6F9"/>
+          </w:tcPr>
+          <w:p>
+            <w:pPr>
+              <w:jc w:val="center"/>
+            </w:pPr>
+            <w:r>
+              <w:rPr>
+                <w:rFonts w:ascii="Calibri" w:hAnsi="Calibri" w:eastAsia="黑体"/>
+                <w:b/>
+                <w:sz w:val="20"/>
+              </w:rPr>
+              <w:t>含义</w:t>
+            </w:r>
+          </w:p>
+        </w:tc>
+        <w:tc>
+          <w:tcPr>
+            <w:tcW w:type="dxa" w:w="3528"/>
+            <w:vAlign w:val="center"/>
+            <w:tcMar>
+              <w:top w:w="80" w:type="dxa"/>
+              <w:start w:w="120" w:type="dxa"/>
+              <w:bottom w:w="80" w:type="dxa"/>
+              <w:end w:w="120" w:type="dxa"/>
+            </w:tcMar>
+            <w:shd w:fill="F4F6F9"/>
+          </w:tcPr>
+          <w:p>
+            <w:pPr>
+              <w:jc w:val="center"/>
+            </w:pPr>
+            <w:r>
+              <w:rPr>
+                <w:rFonts w:ascii="Calibri" w:hAnsi="Calibri" w:eastAsia="黑体"/>
+                <w:b/>
+                <w:sz w:val="20"/>
+              </w:rPr>
+              <w:t>代码依据</w:t>
+            </w:r>
+          </w:p>
+        </w:tc>
+      </w:tr>
+      <w:tr>
+        <w:tc>
+          <w:tcPr>
+            <w:tcW w:type="dxa" w:w="2304"/>
+            <w:vAlign w:val="center"/>
+            <w:tcMar>
+              <w:top w:w="80" w:type="dxa"/>
+              <w:start w:w="120" w:type="dxa"/>
+              <w:bottom w:w="80" w:type="dxa"/>
+              <w:end w:w="120" w:type="dxa"/>
+            </w:tcMar>
+          </w:tcPr>
+          <w:p>
+            <w:pPr>
+              <w:jc w:val="left"/>
+            </w:pPr>
+            <w:r>
+              <w:rPr>
+                <w:rFonts w:ascii="Calibri" w:hAnsi="Calibri" w:eastAsia="宋体"/>
+                <w:sz w:val="20"/>
+              </w:rPr>
+              <w:t>goal_tracking</w:t>
+            </w:r>
+          </w:p>
+        </w:tc>
+        <w:tc>
+          <w:tcPr>
+            <w:tcW w:type="dxa" w:w="3528"/>
+            <w:vAlign w:val="center"/>
+            <w:tcMar>
+              <w:top w:w="80" w:type="dxa"/>
+              <w:start w:w="120" w:type="dxa"/>
+              <w:bottom w:w="80" w:type="dxa"/>
+              <w:end w:w="120" w:type="dxa"/>
+            </w:tcMar>
+          </w:tcPr>
+          <w:p>
+            <w:pPr>
+              <w:jc w:val="left"/>
+            </w:pPr>
+            <w:r>
+              <w:rPr>
+                <w:rFonts w:ascii="Calibri" w:hAnsi="Calibri" w:eastAsia="宋体"/>
+                <w:sz w:val="20"/>
+              </w:rPr>
+              <w:t>记录或展示当前任务目标和进度</w:t>
+            </w:r>
+          </w:p>
+        </w:tc>
+        <w:tc>
+          <w:tcPr>
+            <w:tcW w:type="dxa" w:w="3528"/>
+            <w:vAlign w:val="center"/>
+            <w:tcMar>
+              <w:top w:w="80" w:type="dxa"/>
+              <w:start w:w="120" w:type="dxa"/>
+              <w:bottom w:w="80" w:type="dxa"/>
+              <w:end w:w="120" w:type="dxa"/>
+            </w:tcMar>
+          </w:tcPr>
+          <w:p>
+            <w:pPr>
+              <w:jc w:val="left"/>
+            </w:pPr>
+            <w:r>
+              <w:rPr>
+                <w:rFonts w:ascii="Calibri" w:hAnsi="Calibri" w:eastAsia="宋体"/>
+                <w:sz w:val="20"/>
+              </w:rPr>
+              <w:t>goals/store.py、/api/goals</w:t>
+            </w:r>
+          </w:p>
+        </w:tc>
+      </w:tr>
+      <w:tr>
+        <w:tc>
+          <w:tcPr>
+            <w:tcW w:type="dxa" w:w="2304"/>
+            <w:vAlign w:val="center"/>
+            <w:tcMar>
+              <w:top w:w="80" w:type="dxa"/>
+              <w:start w:w="120" w:type="dxa"/>
+              <w:bottom w:w="80" w:type="dxa"/>
+              <w:end w:w="120" w:type="dxa"/>
+            </w:tcMar>
+          </w:tcPr>
+          <w:p>
+            <w:pPr>
+              <w:jc w:val="left"/>
+            </w:pPr>
+            <w:r>
+              <w:rPr>
+                <w:rFonts w:ascii="Calibri" w:hAnsi="Calibri" w:eastAsia="宋体"/>
+                <w:sz w:val="20"/>
+              </w:rPr>
+              <w:t>coordinator_route</w:t>
+            </w:r>
+          </w:p>
+        </w:tc>
+        <w:tc>
+          <w:tcPr>
+            <w:tcW w:type="dxa" w:w="3528"/>
+            <w:vAlign w:val="center"/>
+            <w:tcMar>
+              <w:top w:w="80" w:type="dxa"/>
+              <w:start w:w="120" w:type="dxa"/>
+              <w:bottom w:w="80" w:type="dxa"/>
+              <w:end w:w="120" w:type="dxa"/>
+            </w:tcMar>
+          </w:tcPr>
+          <w:p>
+            <w:pPr>
+              <w:jc w:val="left"/>
+            </w:pPr>
+            <w:r>
+              <w:rPr>
+                <w:rFonts w:ascii="Calibri" w:hAnsi="Calibri" w:eastAsia="宋体"/>
+                <w:sz w:val="20"/>
+              </w:rPr>
+              <w:t>由协调Agent判断任务方向</w:t>
+            </w:r>
+          </w:p>
+        </w:tc>
+        <w:tc>
+          <w:tcPr>
+            <w:tcW w:type="dxa" w:w="3528"/>
+            <w:vAlign w:val="center"/>
+            <w:tcMar>
+              <w:top w:w="80" w:type="dxa"/>
+              <w:start w:w="120" w:type="dxa"/>
+              <w:bottom w:w="80" w:type="dxa"/>
+              <w:end w:w="120" w:type="dxa"/>
+            </w:tcMar>
+          </w:tcPr>
+          <w:p>
+            <w:pPr>
+              <w:jc w:val="left"/>
+            </w:pPr>
+            <w:r>
+              <w:rPr>
+                <w:rFonts w:ascii="Calibri" w:hAnsi="Calibri" w:eastAsia="宋体"/>
+                <w:sz w:val="20"/>
+              </w:rPr>
+              <w:t>agent_runtime.py</w:t>
+            </w:r>
+          </w:p>
+        </w:tc>
+      </w:tr>
+      <w:tr>
+        <w:tc>
+          <w:tcPr>
+            <w:tcW w:type="dxa" w:w="2304"/>
+            <w:vAlign w:val="center"/>
+            <w:tcMar>
+              <w:top w:w="80" w:type="dxa"/>
+              <w:start w:w="120" w:type="dxa"/>
+              <w:bottom w:w="80" w:type="dxa"/>
+              <w:end w:w="120" w:type="dxa"/>
+            </w:tcMar>
+          </w:tcPr>
+          <w:p>
+            <w:pPr>
+              <w:jc w:val="left"/>
+            </w:pPr>
+            <w:r>
+              <w:rPr>
+                <w:rFonts w:ascii="Calibri" w:hAnsi="Calibri" w:eastAsia="宋体"/>
+                <w:sz w:val="20"/>
+              </w:rPr>
+              <w:t>skill_selection</w:t>
+            </w:r>
+          </w:p>
+        </w:tc>
+        <w:tc>
+          <w:tcPr>
+            <w:tcW w:type="dxa" w:w="3528"/>
+            <w:vAlign w:val="center"/>
+            <w:tcMar>
+              <w:top w:w="80" w:type="dxa"/>
+              <w:start w:w="120" w:type="dxa"/>
+              <w:bottom w:w="80" w:type="dxa"/>
+              <w:end w:w="120" w:type="dxa"/>
+            </w:tcMar>
+          </w:tcPr>
+          <w:p>
+            <w:pPr>
+              <w:jc w:val="left"/>
+            </w:pPr>
+            <w:r>
+              <w:rPr>
+                <w:rFonts w:ascii="Calibri" w:hAnsi="Calibri" w:eastAsia="宋体"/>
+                <w:sz w:val="20"/>
+              </w:rPr>
+              <w:t>选择相关本地技能</w:t>
+            </w:r>
+          </w:p>
+        </w:tc>
+        <w:tc>
+          <w:tcPr>
+            <w:tcW w:type="dxa" w:w="3528"/>
+            <w:vAlign w:val="center"/>
+            <w:tcMar>
+              <w:top w:w="80" w:type="dxa"/>
+              <w:start w:w="120" w:type="dxa"/>
+              <w:bottom w:w="80" w:type="dxa"/>
+              <w:end w:w="120" w:type="dxa"/>
+            </w:tcMar>
+          </w:tcPr>
+          <w:p>
+            <w:pPr>
+              <w:jc w:val="left"/>
+            </w:pPr>
+            <w:r>
+              <w:rPr>
+                <w:rFonts w:ascii="Calibri" w:hAnsi="Calibri" w:eastAsia="宋体"/>
+                <w:sz w:val="20"/>
+              </w:rPr>
+              <w:t>skill_system/、skills/</w:t>
+            </w:r>
+          </w:p>
+        </w:tc>
+      </w:tr>
+      <w:tr>
+        <w:tc>
+          <w:tcPr>
+            <w:tcW w:type="dxa" w:w="2304"/>
+            <w:vAlign w:val="center"/>
+            <w:tcMar>
+              <w:top w:w="80" w:type="dxa"/>
+              <w:start w:w="120" w:type="dxa"/>
+              <w:bottom w:w="80" w:type="dxa"/>
+              <w:end w:w="120" w:type="dxa"/>
+            </w:tcMar>
+          </w:tcPr>
+          <w:p>
+            <w:pPr>
+              <w:jc w:val="left"/>
+            </w:pPr>
+            <w:r>
+              <w:rPr>
+                <w:rFonts w:ascii="Calibri" w:hAnsi="Calibri" w:eastAsia="宋体"/>
+                <w:sz w:val="20"/>
+              </w:rPr>
+              <w:t>context_tree_search</w:t>
+            </w:r>
+          </w:p>
+        </w:tc>
+        <w:tc>
+          <w:tcPr>
+            <w:tcW w:type="dxa" w:w="3528"/>
+            <w:vAlign w:val="center"/>
+            <w:tcMar>
+              <w:top w:w="80" w:type="dxa"/>
+              <w:start w:w="120" w:type="dxa"/>
+              <w:bottom w:w="80" w:type="dxa"/>
+              <w:end w:w="120" w:type="dxa"/>
+            </w:tcMar>
+          </w:tcPr>
+          <w:p>
+            <w:pPr>
+              <w:jc w:val="left"/>
+            </w:pPr>
+            <w:r>
+              <w:rPr>
+                <w:rFonts w:ascii="Calibri" w:hAnsi="Calibri" w:eastAsia="宋体"/>
+                <w:sz w:val="20"/>
+              </w:rPr>
+              <w:t>检索相关Context Tree节点</w:t>
+            </w:r>
+          </w:p>
+        </w:tc>
+        <w:tc>
+          <w:tcPr>
+            <w:tcW w:type="dxa" w:w="3528"/>
+            <w:vAlign w:val="center"/>
+            <w:tcMar>
+              <w:top w:w="80" w:type="dxa"/>
+              <w:start w:w="120" w:type="dxa"/>
+              <w:bottom w:w="80" w:type="dxa"/>
+              <w:end w:w="120" w:type="dxa"/>
+            </w:tcMar>
+          </w:tcPr>
+          <w:p>
+            <w:pPr>
+              <w:jc w:val="left"/>
+            </w:pPr>
+            <w:r>
+              <w:rPr>
+                <w:rFonts w:ascii="Calibri" w:hAnsi="Calibri" w:eastAsia="宋体"/>
+                <w:sz w:val="20"/>
+              </w:rPr>
+              <w:t>context_engineering/tree.py</w:t>
+            </w:r>
+          </w:p>
+        </w:tc>
+      </w:tr>
+      <w:tr>
+        <w:tc>
+          <w:tcPr>
+            <w:tcW w:type="dxa" w:w="2304"/>
+            <w:vAlign w:val="center"/>
+            <w:tcMar>
+              <w:top w:w="80" w:type="dxa"/>
+              <w:start w:w="120" w:type="dxa"/>
+              <w:bottom w:w="80" w:type="dxa"/>
+              <w:end w:w="120" w:type="dxa"/>
+            </w:tcMar>
+          </w:tcPr>
+          <w:p>
+            <w:pPr>
+              <w:jc w:val="left"/>
+            </w:pPr>
+            <w:r>
+              <w:rPr>
+                <w:rFonts w:ascii="Calibri" w:hAnsi="Calibri" w:eastAsia="宋体"/>
+                <w:sz w:val="20"/>
+              </w:rPr>
+              <w:t>memory_prefetch</w:t>
+            </w:r>
+          </w:p>
+        </w:tc>
+        <w:tc>
+          <w:tcPr>
+            <w:tcW w:type="dxa" w:w="3528"/>
+            <w:vAlign w:val="center"/>
+            <w:tcMar>
+              <w:top w:w="80" w:type="dxa"/>
+              <w:start w:w="120" w:type="dxa"/>
+              <w:bottom w:w="80" w:type="dxa"/>
+              <w:end w:w="120" w:type="dxa"/>
+            </w:tcMar>
+          </w:tcPr>
+          <w:p>
+            <w:pPr>
+              <w:jc w:val="left"/>
+            </w:pPr>
+            <w:r>
+              <w:rPr>
+                <w:rFonts w:ascii="Calibri" w:hAnsi="Calibri" w:eastAsia="宋体"/>
+                <w:sz w:val="20"/>
+              </w:rPr>
+              <w:t>预取会话记忆、核心记忆和用户偏好</w:t>
+            </w:r>
+          </w:p>
+        </w:tc>
+        <w:tc>
+          <w:tcPr>
+            <w:tcW w:type="dxa" w:w="3528"/>
+            <w:vAlign w:val="center"/>
+            <w:tcMar>
+              <w:top w:w="80" w:type="dxa"/>
+              <w:start w:w="120" w:type="dxa"/>
+              <w:bottom w:w="80" w:type="dxa"/>
+              <w:end w:w="120" w:type="dxa"/>
+            </w:tcMar>
+          </w:tcPr>
+          <w:p>
+            <w:pPr>
+              <w:jc w:val="left"/>
+            </w:pPr>
+            <w:r>
+              <w:rPr>
+                <w:rFonts w:ascii="Calibri" w:hAnsi="Calibri" w:eastAsia="宋体"/>
+                <w:sz w:val="20"/>
+              </w:rPr>
+              <w:t>memory/provider.py</w:t>
+            </w:r>
+          </w:p>
+        </w:tc>
+      </w:tr>
+      <w:tr>
+        <w:tc>
+          <w:tcPr>
+            <w:tcW w:type="dxa" w:w="2304"/>
+            <w:vAlign w:val="center"/>
+            <w:tcMar>
+              <w:top w:w="80" w:type="dxa"/>
+              <w:start w:w="120" w:type="dxa"/>
+              <w:bottom w:w="80" w:type="dxa"/>
+              <w:end w:w="120" w:type="dxa"/>
+            </w:tcMar>
+          </w:tcPr>
+          <w:p>
+            <w:pPr>
+              <w:jc w:val="left"/>
+            </w:pPr>
+            <w:r>
+              <w:rPr>
+                <w:rFonts w:ascii="Calibri" w:hAnsi="Calibri" w:eastAsia="宋体"/>
+                <w:sz w:val="20"/>
+              </w:rPr>
+              <w:t>specialist_agent</w:t>
+            </w:r>
+          </w:p>
+        </w:tc>
+        <w:tc>
+          <w:tcPr>
+            <w:tcW w:type="dxa" w:w="3528"/>
+            <w:vAlign w:val="center"/>
+            <w:tcMar>
+              <w:top w:w="80" w:type="dxa"/>
+              <w:start w:w="120" w:type="dxa"/>
+              <w:bottom w:w="80" w:type="dxa"/>
+              <w:end w:w="120" w:type="dxa"/>
+            </w:tcMar>
+          </w:tcPr>
+          <w:p>
+            <w:pPr>
+              <w:jc w:val="left"/>
+            </w:pPr>
+            <w:r>
+              <w:rPr>
+                <w:rFonts w:ascii="Calibri" w:hAnsi="Calibri" w:eastAsia="宋体"/>
+                <w:sz w:val="20"/>
+              </w:rPr>
+              <w:t>交给QA、Control、Result、Memory、Safety等专业Agent</w:t>
+            </w:r>
+          </w:p>
+        </w:tc>
+        <w:tc>
+          <w:tcPr>
+            <w:tcW w:type="dxa" w:w="3528"/>
+            <w:vAlign w:val="center"/>
+            <w:tcMar>
+              <w:top w:w="80" w:type="dxa"/>
+              <w:start w:w="120" w:type="dxa"/>
+              <w:bottom w:w="80" w:type="dxa"/>
+              <w:end w:w="120" w:type="dxa"/>
+            </w:tcMar>
+          </w:tcPr>
+          <w:p>
+            <w:pPr>
+              <w:jc w:val="left"/>
+            </w:pPr>
+            <w:r>
+              <w:rPr>
+                <w:rFonts w:ascii="Calibri" w:hAnsi="Calibri" w:eastAsia="宋体"/>
+                <w:sz w:val="20"/>
+              </w:rPr>
+              <w:t>agent_runtime.py</w:t>
+            </w:r>
+          </w:p>
+        </w:tc>
+      </w:tr>
+      <w:tr>
+        <w:tc>
+          <w:tcPr>
+            <w:tcW w:type="dxa" w:w="2304"/>
+            <w:vAlign w:val="center"/>
+            <w:tcMar>
+              <w:top w:w="80" w:type="dxa"/>
+              <w:start w:w="120" w:type="dxa"/>
+              <w:bottom w:w="80" w:type="dxa"/>
+              <w:end w:w="120" w:type="dxa"/>
+            </w:tcMar>
+          </w:tcPr>
+          <w:p>
+            <w:pPr>
+              <w:jc w:val="left"/>
+            </w:pPr>
+            <w:r>
+              <w:rPr>
+                <w:rFonts w:ascii="Calibri" w:hAnsi="Calibri" w:eastAsia="宋体"/>
+                <w:sz w:val="20"/>
+              </w:rPr>
+              <w:t>tool_loop</w:t>
+            </w:r>
+          </w:p>
+        </w:tc>
+        <w:tc>
+          <w:tcPr>
+            <w:tcW w:type="dxa" w:w="3528"/>
+            <w:vAlign w:val="center"/>
+            <w:tcMar>
+              <w:top w:w="80" w:type="dxa"/>
+              <w:start w:w="120" w:type="dxa"/>
+              <w:bottom w:w="80" w:type="dxa"/>
+              <w:end w:w="120" w:type="dxa"/>
+            </w:tcMar>
+          </w:tcPr>
+          <w:p>
+            <w:pPr>
+              <w:jc w:val="left"/>
+            </w:pPr>
+            <w:r>
+              <w:rPr>
+                <w:rFonts w:ascii="Calibri" w:hAnsi="Calibri" w:eastAsia="宋体"/>
+                <w:sz w:val="20"/>
+              </w:rPr>
+              <w:t>调用受控工具并返回结构化结果</w:t>
+            </w:r>
+          </w:p>
+        </w:tc>
+        <w:tc>
+          <w:tcPr>
+            <w:tcW w:type="dxa" w:w="3528"/>
+            <w:vAlign w:val="center"/>
+            <w:tcMar>
+              <w:top w:w="80" w:type="dxa"/>
+              <w:start w:w="120" w:type="dxa"/>
+              <w:bottom w:w="80" w:type="dxa"/>
+              <w:end w:w="120" w:type="dxa"/>
+            </w:tcMar>
+          </w:tcPr>
+          <w:p>
+            <w:pPr>
+              <w:jc w:val="left"/>
+            </w:pPr>
+            <w:r>
+              <w:rPr>
+                <w:rFonts w:ascii="Calibri" w:hAnsi="Calibri" w:eastAsia="宋体"/>
+                <w:sz w:val="20"/>
+              </w:rPr>
+              <w:t>agent_core/tools.py、tool_gateway/</w:t>
+            </w:r>
+          </w:p>
+        </w:tc>
+      </w:tr>
+      <w:tr>
+        <w:tc>
+          <w:tcPr>
+            <w:tcW w:type="dxa" w:w="2304"/>
+            <w:vAlign w:val="center"/>
+            <w:tcMar>
+              <w:top w:w="80" w:type="dxa"/>
+              <w:start w:w="120" w:type="dxa"/>
+              <w:bottom w:w="80" w:type="dxa"/>
+              <w:end w:w="120" w:type="dxa"/>
+            </w:tcMar>
+          </w:tcPr>
+          <w:p>
+            <w:pPr>
+              <w:jc w:val="left"/>
+            </w:pPr>
+            <w:r>
+              <w:rPr>
+                <w:rFonts w:ascii="Calibri" w:hAnsi="Calibri" w:eastAsia="宋体"/>
+                <w:sz w:val="20"/>
+              </w:rPr>
+              <w:t>trace_feedback</w:t>
+            </w:r>
+          </w:p>
+        </w:tc>
+        <w:tc>
+          <w:tcPr>
+            <w:tcW w:type="dxa" w:w="3528"/>
+            <w:vAlign w:val="center"/>
+            <w:tcMar>
+              <w:top w:w="80" w:type="dxa"/>
+              <w:start w:w="120" w:type="dxa"/>
+              <w:bottom w:w="80" w:type="dxa"/>
+              <w:end w:w="120" w:type="dxa"/>
+            </w:tcMar>
+          </w:tcPr>
+          <w:p>
+            <w:pPr>
+              <w:jc w:val="left"/>
+            </w:pPr>
+            <w:r>
+              <w:rPr>
+                <w:rFonts w:ascii="Calibri" w:hAnsi="Calibri" w:eastAsia="宋体"/>
+                <w:sz w:val="20"/>
+              </w:rPr>
+              <w:t>记录trace并生成评测或记忆候选</w:t>
+            </w:r>
+          </w:p>
+        </w:tc>
+        <w:tc>
+          <w:tcPr>
+            <w:tcW w:type="dxa" w:w="3528"/>
+            <w:vAlign w:val="center"/>
+            <w:tcMar>
+              <w:top w:w="80" w:type="dxa"/>
+              <w:start w:w="120" w:type="dxa"/>
+              <w:bottom w:w="80" w:type="dxa"/>
+              <w:end w:w="120" w:type="dxa"/>
+            </w:tcMar>
+          </w:tcPr>
+          <w:p>
+            <w:pPr>
+              <w:jc w:val="left"/>
+            </w:pPr>
+            <w:r>
+              <w:rPr>
+                <w:rFonts w:ascii="Calibri" w:hAnsi="Calibri" w:eastAsia="宋体"/>
+                <w:sz w:val="20"/>
+              </w:rPr>
+              <w:t>trace_eval/、memory/provider.py</w:t>
+            </w:r>
+          </w:p>
+        </w:tc>
+      </w:tr>
+    </w:tbl>
+    <w:p/>
+    <w:p>
+      <w:pPr>
+        <w:pStyle w:val="Heading2"/>
       </w:pPr>
       <w:r>
         <w:rPr>
           <w:rFonts w:ascii="Calibri" w:hAnsi="Calibri" w:eastAsia="黑体"/>
           <w:b/>
         </w:rPr>
-        <w:t>4.4.1 文档证据问答流程</w:t>
+        <w:t>4.5 核心流程设计</w:t>
+      </w:r>
+    </w:p>
+    <w:p>
+      <w:pPr>
+        <w:pStyle w:val="Heading3"/>
+      </w:pPr>
+      <w:r>
+        <w:rPr>
+          <w:rFonts w:ascii="Calibri" w:hAnsi="Calibri" w:eastAsia="黑体"/>
+          <w:b/>
+        </w:rPr>
+        <w:t>4.5.1 文档证据问答流程</w:t>
       </w:r>
     </w:p>
     <w:p>
@@ -9022,7 +10635,7 @@
           <w:rFonts w:ascii="Calibri" w:hAnsi="Calibri" w:eastAsia="黑体"/>
           <w:b/>
         </w:rPr>
-        <w:t>4.4.2 命令预览与确认执行流程</w:t>
+        <w:t>4.5.2 命令预览与确认执行流程</w:t>
       </w:r>
     </w:p>
     <w:p>
@@ -9143,7 +10756,7 @@
           <w:rFonts w:ascii="Calibri" w:hAnsi="Calibri" w:eastAsia="黑体"/>
           <w:b/>
         </w:rPr>
-        <w:t>4.4.3 状态与结果解释流程</w:t>
+        <w:t>4.5.3 状态与结果解释流程</w:t>
       </w:r>
     </w:p>
     <w:p>
@@ -9167,7 +10780,7 @@
           <w:rFonts w:ascii="Calibri" w:hAnsi="Calibri" w:eastAsia="黑体"/>
           <w:b/>
         </w:rPr>
-        <w:t>4.4.4 记忆、技能与上下文流程</w:t>
+        <w:t>4.5.4 记忆、技能与上下文流程</w:t>
       </w:r>
     </w:p>
     <w:p>
@@ -9299,7 +10912,7 @@
           <w:rFonts w:ascii="Calibri" w:hAnsi="Calibri" w:eastAsia="黑体"/>
           <w:b/>
         </w:rPr>
-        <w:t>4.5 数据结构设计</w:t>
+        <w:t>4.6 数据结构设计</w:t>
       </w:r>
     </w:p>
     <w:p>
@@ -9324,7 +10937,7 @@
           <w:color w:val="555555"/>
           <w:sz w:val="20"/>
         </w:rPr>
-        <w:t>表4-3 关键数据结构</w:t>
+        <w:t>表4-4 关键数据结构</w:t>
       </w:r>
     </w:p>
     <w:tbl>
@@ -9812,6 +11425,80 @@
                 <w:rFonts w:ascii="Calibri" w:hAnsi="Calibri" w:eastAsia="宋体"/>
                 <w:sz w:val="20"/>
               </w:rPr>
+              <w:t>ContextTreeNode</w:t>
+            </w:r>
+          </w:p>
+        </w:tc>
+        <w:tc>
+          <w:tcPr>
+            <w:tcW w:type="dxa" w:w="3816"/>
+            <w:vAlign w:val="center"/>
+            <w:tcMar>
+              <w:top w:w="80" w:type="dxa"/>
+              <w:start w:w="120" w:type="dxa"/>
+              <w:bottom w:w="80" w:type="dxa"/>
+              <w:end w:w="120" w:type="dxa"/>
+            </w:tcMar>
+          </w:tcPr>
+          <w:p>
+            <w:pPr>
+              <w:jc w:val="left"/>
+            </w:pPr>
+            <w:r>
+              <w:rPr>
+                <w:rFonts w:ascii="Calibri" w:hAnsi="Calibri" w:eastAsia="宋体"/>
+                <w:sz w:val="20"/>
+              </w:rPr>
+              <w:t>id、kind、title、tags、content_preview</w:t>
+            </w:r>
+          </w:p>
+        </w:tc>
+        <w:tc>
+          <w:tcPr>
+            <w:tcW w:type="dxa" w:w="3456"/>
+            <w:vAlign w:val="center"/>
+            <w:tcMar>
+              <w:top w:w="80" w:type="dxa"/>
+              <w:start w:w="120" w:type="dxa"/>
+              <w:bottom w:w="80" w:type="dxa"/>
+              <w:end w:w="120" w:type="dxa"/>
+            </w:tcMar>
+          </w:tcPr>
+          <w:p>
+            <w:pPr>
+              <w:jc w:val="left"/>
+            </w:pPr>
+            <w:r>
+              <w:rPr>
+                <w:rFonts w:ascii="Calibri" w:hAnsi="Calibri" w:eastAsia="宋体"/>
+                <w:sz w:val="20"/>
+              </w:rPr>
+              <w:t>表达可读工作上下文节点</w:t>
+            </w:r>
+          </w:p>
+        </w:tc>
+      </w:tr>
+      <w:tr>
+        <w:tc>
+          <w:tcPr>
+            <w:tcW w:type="dxa" w:w="2088"/>
+            <w:vAlign w:val="center"/>
+            <w:tcMar>
+              <w:top w:w="80" w:type="dxa"/>
+              <w:start w:w="120" w:type="dxa"/>
+              <w:bottom w:w="80" w:type="dxa"/>
+              <w:end w:w="120" w:type="dxa"/>
+            </w:tcMar>
+          </w:tcPr>
+          <w:p>
+            <w:pPr>
+              <w:jc w:val="left"/>
+            </w:pPr>
+            <w:r>
+              <w:rPr>
+                <w:rFonts w:ascii="Calibri" w:hAnsi="Calibri" w:eastAsia="宋体"/>
+                <w:sz w:val="20"/>
+              </w:rPr>
               <w:t>MemoryPatch</w:t>
             </w:r>
           </w:p>
@@ -9861,6 +11548,228 @@
                 <w:sz w:val="20"/>
               </w:rPr>
               <w:t>表达待审批长期记忆写入</w:t>
+            </w:r>
+          </w:p>
+        </w:tc>
+      </w:tr>
+      <w:tr>
+        <w:tc>
+          <w:tcPr>
+            <w:tcW w:type="dxa" w:w="2088"/>
+            <w:vAlign w:val="center"/>
+            <w:tcMar>
+              <w:top w:w="80" w:type="dxa"/>
+              <w:start w:w="120" w:type="dxa"/>
+              <w:bottom w:w="80" w:type="dxa"/>
+              <w:end w:w="120" w:type="dxa"/>
+            </w:tcMar>
+          </w:tcPr>
+          <w:p>
+            <w:pPr>
+              <w:jc w:val="left"/>
+            </w:pPr>
+            <w:r>
+              <w:rPr>
+                <w:rFonts w:ascii="Calibri" w:hAnsi="Calibri" w:eastAsia="宋体"/>
+                <w:sz w:val="20"/>
+              </w:rPr>
+              <w:t>ApiActor</w:t>
+            </w:r>
+          </w:p>
+        </w:tc>
+        <w:tc>
+          <w:tcPr>
+            <w:tcW w:type="dxa" w:w="3816"/>
+            <w:vAlign w:val="center"/>
+            <w:tcMar>
+              <w:top w:w="80" w:type="dxa"/>
+              <w:start w:w="120" w:type="dxa"/>
+              <w:bottom w:w="80" w:type="dxa"/>
+              <w:end w:w="120" w:type="dxa"/>
+            </w:tcMar>
+          </w:tcPr>
+          <w:p>
+            <w:pPr>
+              <w:jc w:val="left"/>
+            </w:pPr>
+            <w:r>
+              <w:rPr>
+                <w:rFonts w:ascii="Calibri" w:hAnsi="Calibri" w:eastAsia="宋体"/>
+                <w:sz w:val="20"/>
+              </w:rPr>
+              <w:t>session_id、operator_id、roles、can_read、can_write</w:t>
+            </w:r>
+          </w:p>
+        </w:tc>
+        <w:tc>
+          <w:tcPr>
+            <w:tcW w:type="dxa" w:w="3456"/>
+            <w:vAlign w:val="center"/>
+            <w:tcMar>
+              <w:top w:w="80" w:type="dxa"/>
+              <w:start w:w="120" w:type="dxa"/>
+              <w:bottom w:w="80" w:type="dxa"/>
+              <w:end w:w="120" w:type="dxa"/>
+            </w:tcMar>
+          </w:tcPr>
+          <w:p>
+            <w:pPr>
+              <w:jc w:val="left"/>
+            </w:pPr>
+            <w:r>
+              <w:rPr>
+                <w:rFonts w:ascii="Calibri" w:hAnsi="Calibri" w:eastAsia="宋体"/>
+                <w:sz w:val="20"/>
+              </w:rPr>
+              <w:t>表达Web API调用者身份和权限</w:t>
+            </w:r>
+          </w:p>
+        </w:tc>
+      </w:tr>
+      <w:tr>
+        <w:tc>
+          <w:tcPr>
+            <w:tcW w:type="dxa" w:w="2088"/>
+            <w:vAlign w:val="center"/>
+            <w:tcMar>
+              <w:top w:w="80" w:type="dxa"/>
+              <w:start w:w="120" w:type="dxa"/>
+              <w:bottom w:w="80" w:type="dxa"/>
+              <w:end w:w="120" w:type="dxa"/>
+            </w:tcMar>
+          </w:tcPr>
+          <w:p>
+            <w:pPr>
+              <w:jc w:val="left"/>
+            </w:pPr>
+            <w:r>
+              <w:rPr>
+                <w:rFonts w:ascii="Calibri" w:hAnsi="Calibri" w:eastAsia="宋体"/>
+                <w:sz w:val="20"/>
+              </w:rPr>
+              <w:t>StoredCommandPreview</w:t>
+            </w:r>
+          </w:p>
+        </w:tc>
+        <w:tc>
+          <w:tcPr>
+            <w:tcW w:type="dxa" w:w="3816"/>
+            <w:vAlign w:val="center"/>
+            <w:tcMar>
+              <w:top w:w="80" w:type="dxa"/>
+              <w:start w:w="120" w:type="dxa"/>
+              <w:bottom w:w="80" w:type="dxa"/>
+              <w:end w:w="120" w:type="dxa"/>
+            </w:tcMar>
+          </w:tcPr>
+          <w:p>
+            <w:pPr>
+              <w:jc w:val="left"/>
+            </w:pPr>
+            <w:r>
+              <w:rPr>
+                <w:rFonts w:ascii="Calibri" w:hAnsi="Calibri" w:eastAsia="宋体"/>
+                <w:sz w:val="20"/>
+              </w:rPr>
+              <w:t>preview_id、preview_hash、confirmation_token、session_id、operator_id</w:t>
+            </w:r>
+          </w:p>
+        </w:tc>
+        <w:tc>
+          <w:tcPr>
+            <w:tcW w:type="dxa" w:w="3456"/>
+            <w:vAlign w:val="center"/>
+            <w:tcMar>
+              <w:top w:w="80" w:type="dxa"/>
+              <w:start w:w="120" w:type="dxa"/>
+              <w:bottom w:w="80" w:type="dxa"/>
+              <w:end w:w="120" w:type="dxa"/>
+            </w:tcMar>
+          </w:tcPr>
+          <w:p>
+            <w:pPr>
+              <w:jc w:val="left"/>
+            </w:pPr>
+            <w:r>
+              <w:rPr>
+                <w:rFonts w:ascii="Calibri" w:hAnsi="Calibri" w:eastAsia="宋体"/>
+                <w:sz w:val="20"/>
+              </w:rPr>
+              <w:t>表达会话绑定命令确认凭据</w:t>
+            </w:r>
+          </w:p>
+        </w:tc>
+      </w:tr>
+      <w:tr>
+        <w:tc>
+          <w:tcPr>
+            <w:tcW w:type="dxa" w:w="2088"/>
+            <w:vAlign w:val="center"/>
+            <w:tcMar>
+              <w:top w:w="80" w:type="dxa"/>
+              <w:start w:w="120" w:type="dxa"/>
+              <w:bottom w:w="80" w:type="dxa"/>
+              <w:end w:w="120" w:type="dxa"/>
+            </w:tcMar>
+          </w:tcPr>
+          <w:p>
+            <w:pPr>
+              <w:jc w:val="left"/>
+            </w:pPr>
+            <w:r>
+              <w:rPr>
+                <w:rFonts w:ascii="Calibri" w:hAnsi="Calibri" w:eastAsia="宋体"/>
+                <w:sz w:val="20"/>
+              </w:rPr>
+              <w:t>AgentGoal</w:t>
+            </w:r>
+          </w:p>
+        </w:tc>
+        <w:tc>
+          <w:tcPr>
+            <w:tcW w:type="dxa" w:w="3816"/>
+            <w:vAlign w:val="center"/>
+            <w:tcMar>
+              <w:top w:w="80" w:type="dxa"/>
+              <w:start w:w="120" w:type="dxa"/>
+              <w:bottom w:w="80" w:type="dxa"/>
+              <w:end w:w="120" w:type="dxa"/>
+            </w:tcMar>
+          </w:tcPr>
+          <w:p>
+            <w:pPr>
+              <w:jc w:val="left"/>
+            </w:pPr>
+            <w:r>
+              <w:rPr>
+                <w:rFonts w:ascii="Calibri" w:hAnsi="Calibri" w:eastAsia="宋体"/>
+                <w:sz w:val="20"/>
+              </w:rPr>
+              <w:t>id、session_id、objective、status、progress</w:t>
+            </w:r>
+          </w:p>
+        </w:tc>
+        <w:tc>
+          <w:tcPr>
+            <w:tcW w:type="dxa" w:w="3456"/>
+            <w:vAlign w:val="center"/>
+            <w:tcMar>
+              <w:top w:w="80" w:type="dxa"/>
+              <w:start w:w="120" w:type="dxa"/>
+              <w:bottom w:w="80" w:type="dxa"/>
+              <w:end w:w="120" w:type="dxa"/>
+            </w:tcMar>
+          </w:tcPr>
+          <w:p>
+            <w:pPr>
+              <w:jc w:val="left"/>
+            </w:pPr>
+            <w:r>
+              <w:rPr>
+                <w:rFonts w:ascii="Calibri" w:hAnsi="Calibri" w:eastAsia="宋体"/>
+                <w:sz w:val="20"/>
+              </w:rPr>
+              <w:t>表达Agent工作目标和进度</w:t>
             </w:r>
           </w:p>
         </w:tc>
@@ -9950,7 +11859,7 @@
           <w:rFonts w:ascii="Calibri" w:hAnsi="Calibri" w:eastAsia="黑体"/>
           <w:b/>
         </w:rPr>
-        <w:t>4.6 部署与集成设计</w:t>
+        <w:t>4.7 部署与集成设计</w:t>
       </w:r>
     </w:p>
     <w:p>
@@ -9986,7 +11895,7 @@
           <w:rFonts w:ascii="Calibri" w:hAnsi="Calibri" w:eastAsia="黑体"/>
           <w:b/>
         </w:rPr>
-        <w:t>4.7 本章小结</w:t>
+        <w:t>4.8 本章小结</w:t>
       </w:r>
     </w:p>
     <w:p>
@@ -9998,7 +11907,7 @@
           <w:rFonts w:ascii="Calibri" w:hAnsi="Calibri" w:eastAsia="宋体"/>
           <w:sz w:val="22"/>
         </w:rPr>
-        <w:t>本章给出了系统总体架构设计，包括分层架构、双路径运行时、核心流程、数据结构和部署集成方案。总体设计强调低侵入桥接、结构化命令、安全审批、Memory OS和可追踪Agent运行时，为下一章的核心模块实现说明奠定基础。</w:t>
+        <w:t>本章给出了系统总体架构设计，包括分层架构、双路径运行时、Agent工作空间、Context Tree、核心流程、数据结构和部署集成方案。总体设计强调低侵入桥接、结构化命令、API安全、安全审批、Memory OS、目标跟踪和可追踪Agent运行时，为下一章的核心模块实现说明奠定基础。</w:t>
       </w:r>
     </w:p>
     <w:p>
@@ -10059,7 +11968,7 @@
           <w:rFonts w:ascii="Calibri" w:hAnsi="Calibri" w:eastAsia="宋体"/>
           <w:sz w:val="22"/>
         </w:rPr>
-        <w:t>`DAC3DAgentRuntime.create`在上述助手基础上创建Agent运行时。其`__post_init__`会初始化Agent会话存储、ConversationMemoryStore、LocalMemoryProvider和SkillRegistry。Web侧再通过`DAC3DAgentChatAdapter`把Agent运行时暴露为原有聊天接口，并额外记录记忆、trace和上下文。</w:t>
+        <w:t>`DAC3DAgentRuntime.create`在上述助手基础上创建Agent运行时。其`__post_init__`会初始化Agent会话存储、ConversationMemoryStore、LocalMemoryProvider和SkillRegistry。Web侧再通过`DAC3DAgentChatAdapter`把Agent运行时暴露为原有聊天接口，并额外装配Context Tree、Goal Store、TraceLogger和Context Builder，使聊天、工作流预览、目标跟踪、记忆审批和评测可以共享同一运行时上下文。</w:t>
       </w:r>
     </w:p>
     <w:p>
@@ -10940,7 +12849,7 @@
           <w:rFonts w:ascii="Calibri" w:hAnsi="Calibri" w:eastAsia="宋体"/>
           <w:sz w:val="22"/>
         </w:rPr>
-        <w:t>Agent运行时通过OpenAI Agents SDK构建协调Agent和专业Agent，并注册34个工具。为支持本地测试，代码还实现了`LocalValidationAgentModel`，它可以根据输入确定性选择工具并返回结构化payload，使CI和本地评测不依赖外部模型。</w:t>
+        <w:t>Agent运行时通过OpenAI Agents SDK构建协调Agent和专业Agent，并注册34个工具。为支持本地测试，代码还实现了`LocalValidationAgentModel`，它可以根据输入确定性选择工具并返回结构化payload，使CI和本地评测不依赖外部模型。当前`agent_workspace`接口还会返回entry_agent、specialist_agents、tool_groups、capabilities、skills、context_tree、memory_os、goals和workflow，供前端工作台展示。</w:t>
       </w:r>
     </w:p>
     <w:p>
@@ -10952,7 +12861,7 @@
           <w:rFonts w:ascii="Calibri" w:hAnsi="Calibri" w:eastAsia="宋体"/>
           <w:sz w:val="22"/>
         </w:rPr>
-        <w:t>Context Builder会根据任务类型选择上下文。控制类任务会包含安全策略和运行状态；状态或结果任务会包含压缩状态与latest_result；技能上下文来自Skill Registry；记忆上下文来自Memory Provider。被排除的上下文包括完整文档语料、完整历史对话、原始命令桥接文件以及secrets和环境变量。</w:t>
+        <w:t>Context Builder会根据任务类型选择上下文。控制类任务会包含安全策略和运行状态；状态或结果任务会包含压缩状态与latest_result；技能上下文来自Skill Registry；Context Tree上下文来自FileBackedContextTree；记忆上下文来自Memory Provider。被排除的上下文包括完整文档语料、完整历史对话、原始命令桥接文件以及secrets和环境变量。</w:t>
       </w:r>
     </w:p>
     <w:p>
@@ -11663,7 +13572,7 @@
           <w:rFonts w:ascii="Calibri" w:hAnsi="Calibri" w:eastAsia="黑体"/>
           <w:b/>
         </w:rPr>
-        <w:t>5.8 前端工作台与主系统界面实现</w:t>
+        <w:t>5.8 Web API安全、目标工作台与前端实现</w:t>
       </w:r>
     </w:p>
     <w:p>
@@ -11675,7 +13584,584 @@
           <w:rFonts w:ascii="Calibri" w:hAnsi="Calibri" w:eastAsia="宋体"/>
           <w:sz w:val="22"/>
         </w:rPr>
-        <w:t>`ui/web_api.py`提供FastAPI接口，包括健康检查、运行时摘要、文档索引摘要、聊天、流式聊天、命令批准、评测运行、评测草稿、trace读取、记忆补丁审批和文档索引构建等。`ui2/src`是主要React工作台，支持聊天流式显示、结构化数据面板、DAC-3D运行状态卡、Tool Gateway视图、命令批准按钮、记忆补丁审批和评测面板。`frontend/src`则保留工业设备信息管理Agent演示界面，用于验证工具化架构扩展能力。</w:t>
+        <w:t>`ui/web_api.py`提供FastAPI接口，包括健康检查、运行时摘要、Agent工作空间、工作流预览、文档索引摘要、聊天、流式聊天、命令预览、命令确认、命令批准、目标管理、评测运行、评测草稿、trace读取、记忆补丁审批和文档索引构建等。接口入口不再默认信任前端请求，而是通过`require_api_actor`读取header、body和query中的session_id、operator_id和roles，要求同一字段在不同来源保持一致。</w:t>
+      </w:r>
+    </w:p>
+    <w:p>
+      <w:pPr>
+        <w:ind w:firstLine="432"/>
+      </w:pPr>
+      <w:r>
+        <w:rPr>
+          <w:rFonts w:ascii="Calibri" w:hAnsi="Calibri" w:eastAsia="宋体"/>
+          <w:sz w:val="22"/>
+        </w:rPr>
+        <w:t>API安全实现分为三层。第一层是身份和权限：viewer只能读取，operator可执行写操作，admin或security_admin才能审批记忆和技能补丁。第二层是请求中间件：所有请求都会获得X-Request-ID和X-Trace-ID，API路径受到进程内限流保护，异常统一返回结构化错误而不泄漏堆栈。第三层是命令确认：`ConfirmationTokenStore`为命令预览生成一次性token，并绑定session_id、operator_id和preview_hash，确认时检查过期、重放、操作员不匹配和预览hash变化。</w:t>
+      </w:r>
+    </w:p>
+    <w:p>
+      <w:pPr>
+        <w:pStyle w:val="ThesisCaption"/>
+      </w:pPr>
+      <w:r>
+        <w:rPr>
+          <w:rFonts w:ascii="Calibri" w:hAnsi="Calibri" w:eastAsia="宋体"/>
+          <w:color w:val="555555"/>
+          <w:sz w:val="20"/>
+        </w:rPr>
+        <w:t>表5-3 Web API安全与工作台接口</w:t>
+      </w:r>
+    </w:p>
+    <w:tbl>
+      <w:tblPr>
+        <w:tblStyle w:val="TableGrid"/>
+        <w:tblW w:type="dxa" w:w="9360"/>
+        <w:tblLayout w:type="fixed"/>
+        <w:tblLook w:firstColumn="1" w:firstRow="1" w:lastColumn="0" w:lastRow="0" w:noHBand="0" w:noVBand="1" w:val="04A0"/>
+        <w:jc w:val="center"/>
+        <w:tblInd w:type="dxa" w:w="120"/>
+      </w:tblPr>
+      <w:tblGrid>
+        <w:gridCol w:w="2088"/>
+        <w:gridCol w:w="3096"/>
+        <w:gridCol w:w="4176"/>
+      </w:tblGrid>
+      <w:tr>
+        <w:tc>
+          <w:tcPr>
+            <w:tcW w:type="dxa" w:w="2088"/>
+            <w:vAlign w:val="center"/>
+            <w:tcMar>
+              <w:top w:w="80" w:type="dxa"/>
+              <w:start w:w="120" w:type="dxa"/>
+              <w:bottom w:w="80" w:type="dxa"/>
+              <w:end w:w="120" w:type="dxa"/>
+            </w:tcMar>
+            <w:shd w:fill="F4F6F9"/>
+          </w:tcPr>
+          <w:p>
+            <w:pPr>
+              <w:jc w:val="center"/>
+            </w:pPr>
+            <w:r>
+              <w:rPr>
+                <w:rFonts w:ascii="Calibri" w:hAnsi="Calibri" w:eastAsia="黑体"/>
+                <w:b/>
+                <w:sz w:val="20"/>
+              </w:rPr>
+              <w:t>能力</w:t>
+            </w:r>
+          </w:p>
+        </w:tc>
+        <w:tc>
+          <w:tcPr>
+            <w:tcW w:type="dxa" w:w="3096"/>
+            <w:vAlign w:val="center"/>
+            <w:tcMar>
+              <w:top w:w="80" w:type="dxa"/>
+              <w:start w:w="120" w:type="dxa"/>
+              <w:bottom w:w="80" w:type="dxa"/>
+              <w:end w:w="120" w:type="dxa"/>
+            </w:tcMar>
+            <w:shd w:fill="F4F6F9"/>
+          </w:tcPr>
+          <w:p>
+            <w:pPr>
+              <w:jc w:val="center"/>
+            </w:pPr>
+            <w:r>
+              <w:rPr>
+                <w:rFonts w:ascii="Calibri" w:hAnsi="Calibri" w:eastAsia="黑体"/>
+                <w:b/>
+                <w:sz w:val="20"/>
+              </w:rPr>
+              <w:t>代码位置</w:t>
+            </w:r>
+          </w:p>
+        </w:tc>
+        <w:tc>
+          <w:tcPr>
+            <w:tcW w:type="dxa" w:w="4176"/>
+            <w:vAlign w:val="center"/>
+            <w:tcMar>
+              <w:top w:w="80" w:type="dxa"/>
+              <w:start w:w="120" w:type="dxa"/>
+              <w:bottom w:w="80" w:type="dxa"/>
+              <w:end w:w="120" w:type="dxa"/>
+            </w:tcMar>
+            <w:shd w:fill="F4F6F9"/>
+          </w:tcPr>
+          <w:p>
+            <w:pPr>
+              <w:jc w:val="center"/>
+            </w:pPr>
+            <w:r>
+              <w:rPr>
+                <w:rFonts w:ascii="Calibri" w:hAnsi="Calibri" w:eastAsia="黑体"/>
+                <w:b/>
+                <w:sz w:val="20"/>
+              </w:rPr>
+              <w:t>实现要点</w:t>
+            </w:r>
+          </w:p>
+        </w:tc>
+      </w:tr>
+      <w:tr>
+        <w:tc>
+          <w:tcPr>
+            <w:tcW w:type="dxa" w:w="2088"/>
+            <w:vAlign w:val="center"/>
+            <w:tcMar>
+              <w:top w:w="80" w:type="dxa"/>
+              <w:start w:w="120" w:type="dxa"/>
+              <w:bottom w:w="80" w:type="dxa"/>
+              <w:end w:w="120" w:type="dxa"/>
+            </w:tcMar>
+          </w:tcPr>
+          <w:p>
+            <w:pPr>
+              <w:jc w:val="left"/>
+            </w:pPr>
+            <w:r>
+              <w:rPr>
+                <w:rFonts w:ascii="Calibri" w:hAnsi="Calibri" w:eastAsia="宋体"/>
+                <w:sz w:val="20"/>
+              </w:rPr>
+              <w:t>API Actor</w:t>
+            </w:r>
+          </w:p>
+        </w:tc>
+        <w:tc>
+          <w:tcPr>
+            <w:tcW w:type="dxa" w:w="3096"/>
+            <w:vAlign w:val="center"/>
+            <w:tcMar>
+              <w:top w:w="80" w:type="dxa"/>
+              <w:start w:w="120" w:type="dxa"/>
+              <w:bottom w:w="80" w:type="dxa"/>
+              <w:end w:w="120" w:type="dxa"/>
+            </w:tcMar>
+          </w:tcPr>
+          <w:p>
+            <w:pPr>
+              <w:jc w:val="left"/>
+            </w:pPr>
+            <w:r>
+              <w:rPr>
+                <w:rFonts w:ascii="Calibri" w:hAnsi="Calibri" w:eastAsia="宋体"/>
+                <w:sz w:val="20"/>
+              </w:rPr>
+              <w:t>ui/auth.py</w:t>
+            </w:r>
+          </w:p>
+        </w:tc>
+        <w:tc>
+          <w:tcPr>
+            <w:tcW w:type="dxa" w:w="4176"/>
+            <w:vAlign w:val="center"/>
+            <w:tcMar>
+              <w:top w:w="80" w:type="dxa"/>
+              <w:start w:w="120" w:type="dxa"/>
+              <w:bottom w:w="80" w:type="dxa"/>
+              <w:end w:w="120" w:type="dxa"/>
+            </w:tcMar>
+          </w:tcPr>
+          <w:p>
+            <w:pPr>
+              <w:jc w:val="left"/>
+            </w:pPr>
+            <w:r>
+              <w:rPr>
+                <w:rFonts w:ascii="Calibri" w:hAnsi="Calibri" w:eastAsia="宋体"/>
+                <w:sz w:val="20"/>
+              </w:rPr>
+              <w:t>session_id、operator_id和roles归一化，读写权限分离</w:t>
+            </w:r>
+          </w:p>
+        </w:tc>
+      </w:tr>
+      <w:tr>
+        <w:tc>
+          <w:tcPr>
+            <w:tcW w:type="dxa" w:w="2088"/>
+            <w:vAlign w:val="center"/>
+            <w:tcMar>
+              <w:top w:w="80" w:type="dxa"/>
+              <w:start w:w="120" w:type="dxa"/>
+              <w:bottom w:w="80" w:type="dxa"/>
+              <w:end w:w="120" w:type="dxa"/>
+            </w:tcMar>
+          </w:tcPr>
+          <w:p>
+            <w:pPr>
+              <w:jc w:val="left"/>
+            </w:pPr>
+            <w:r>
+              <w:rPr>
+                <w:rFonts w:ascii="Calibri" w:hAnsi="Calibri" w:eastAsia="宋体"/>
+                <w:sz w:val="20"/>
+              </w:rPr>
+              <w:t>安全中间件</w:t>
+            </w:r>
+          </w:p>
+        </w:tc>
+        <w:tc>
+          <w:tcPr>
+            <w:tcW w:type="dxa" w:w="3096"/>
+            <w:vAlign w:val="center"/>
+            <w:tcMar>
+              <w:top w:w="80" w:type="dxa"/>
+              <w:start w:w="120" w:type="dxa"/>
+              <w:bottom w:w="80" w:type="dxa"/>
+              <w:end w:w="120" w:type="dxa"/>
+            </w:tcMar>
+          </w:tcPr>
+          <w:p>
+            <w:pPr>
+              <w:jc w:val="left"/>
+            </w:pPr>
+            <w:r>
+              <w:rPr>
+                <w:rFonts w:ascii="Calibri" w:hAnsi="Calibri" w:eastAsia="宋体"/>
+                <w:sz w:val="20"/>
+              </w:rPr>
+              <w:t>ui/security_middleware.py</w:t>
+            </w:r>
+          </w:p>
+        </w:tc>
+        <w:tc>
+          <w:tcPr>
+            <w:tcW w:type="dxa" w:w="4176"/>
+            <w:vAlign w:val="center"/>
+            <w:tcMar>
+              <w:top w:w="80" w:type="dxa"/>
+              <w:start w:w="120" w:type="dxa"/>
+              <w:bottom w:w="80" w:type="dxa"/>
+              <w:end w:w="120" w:type="dxa"/>
+            </w:tcMar>
+          </w:tcPr>
+          <w:p>
+            <w:pPr>
+              <w:jc w:val="left"/>
+            </w:pPr>
+            <w:r>
+              <w:rPr>
+                <w:rFonts w:ascii="Calibri" w:hAnsi="Calibri" w:eastAsia="宋体"/>
+                <w:sz w:val="20"/>
+              </w:rPr>
+              <w:t>请求ID、Trace ID、限流和结构化错误响应</w:t>
+            </w:r>
+          </w:p>
+        </w:tc>
+      </w:tr>
+      <w:tr>
+        <w:tc>
+          <w:tcPr>
+            <w:tcW w:type="dxa" w:w="2088"/>
+            <w:vAlign w:val="center"/>
+            <w:tcMar>
+              <w:top w:w="80" w:type="dxa"/>
+              <w:start w:w="120" w:type="dxa"/>
+              <w:bottom w:w="80" w:type="dxa"/>
+              <w:end w:w="120" w:type="dxa"/>
+            </w:tcMar>
+          </w:tcPr>
+          <w:p>
+            <w:pPr>
+              <w:jc w:val="left"/>
+            </w:pPr>
+            <w:r>
+              <w:rPr>
+                <w:rFonts w:ascii="Calibri" w:hAnsi="Calibri" w:eastAsia="宋体"/>
+                <w:sz w:val="20"/>
+              </w:rPr>
+              <w:t>会话确认token</w:t>
+            </w:r>
+          </w:p>
+        </w:tc>
+        <w:tc>
+          <w:tcPr>
+            <w:tcW w:type="dxa" w:w="3096"/>
+            <w:vAlign w:val="center"/>
+            <w:tcMar>
+              <w:top w:w="80" w:type="dxa"/>
+              <w:start w:w="120" w:type="dxa"/>
+              <w:bottom w:w="80" w:type="dxa"/>
+              <w:end w:w="120" w:type="dxa"/>
+            </w:tcMar>
+          </w:tcPr>
+          <w:p>
+            <w:pPr>
+              <w:jc w:val="left"/>
+            </w:pPr>
+            <w:r>
+              <w:rPr>
+                <w:rFonts w:ascii="Calibri" w:hAnsi="Calibri" w:eastAsia="宋体"/>
+                <w:sz w:val="20"/>
+              </w:rPr>
+              <w:t>ui/session.py</w:t>
+            </w:r>
+          </w:p>
+        </w:tc>
+        <w:tc>
+          <w:tcPr>
+            <w:tcW w:type="dxa" w:w="4176"/>
+            <w:vAlign w:val="center"/>
+            <w:tcMar>
+              <w:top w:w="80" w:type="dxa"/>
+              <w:start w:w="120" w:type="dxa"/>
+              <w:bottom w:w="80" w:type="dxa"/>
+              <w:end w:w="120" w:type="dxa"/>
+            </w:tcMar>
+          </w:tcPr>
+          <w:p>
+            <w:pPr>
+              <w:jc w:val="left"/>
+            </w:pPr>
+            <w:r>
+              <w:rPr>
+                <w:rFonts w:ascii="Calibri" w:hAnsi="Calibri" w:eastAsia="宋体"/>
+                <w:sz w:val="20"/>
+              </w:rPr>
+              <w:t>命令确认绑定session、operator、preview_hash并防重放</w:t>
+            </w:r>
+          </w:p>
+        </w:tc>
+      </w:tr>
+      <w:tr>
+        <w:tc>
+          <w:tcPr>
+            <w:tcW w:type="dxa" w:w="2088"/>
+            <w:vAlign w:val="center"/>
+            <w:tcMar>
+              <w:top w:w="80" w:type="dxa"/>
+              <w:start w:w="120" w:type="dxa"/>
+              <w:bottom w:w="80" w:type="dxa"/>
+              <w:end w:w="120" w:type="dxa"/>
+            </w:tcMar>
+          </w:tcPr>
+          <w:p>
+            <w:pPr>
+              <w:jc w:val="left"/>
+            </w:pPr>
+            <w:r>
+              <w:rPr>
+                <w:rFonts w:ascii="Calibri" w:hAnsi="Calibri" w:eastAsia="宋体"/>
+                <w:sz w:val="20"/>
+              </w:rPr>
+              <w:t>Agent工作空间</w:t>
+            </w:r>
+          </w:p>
+        </w:tc>
+        <w:tc>
+          <w:tcPr>
+            <w:tcW w:type="dxa" w:w="3096"/>
+            <w:vAlign w:val="center"/>
+            <w:tcMar>
+              <w:top w:w="80" w:type="dxa"/>
+              <w:start w:w="120" w:type="dxa"/>
+              <w:bottom w:w="80" w:type="dxa"/>
+              <w:end w:w="120" w:type="dxa"/>
+            </w:tcMar>
+          </w:tcPr>
+          <w:p>
+            <w:pPr>
+              <w:jc w:val="left"/>
+            </w:pPr>
+            <w:r>
+              <w:rPr>
+                <w:rFonts w:ascii="Calibri" w:hAnsi="Calibri" w:eastAsia="宋体"/>
+                <w:sz w:val="20"/>
+              </w:rPr>
+              <w:t>agent_runtime.py、/api/agent/workspace</w:t>
+            </w:r>
+          </w:p>
+        </w:tc>
+        <w:tc>
+          <w:tcPr>
+            <w:tcW w:type="dxa" w:w="4176"/>
+            <w:vAlign w:val="center"/>
+            <w:tcMar>
+              <w:top w:w="80" w:type="dxa"/>
+              <w:start w:w="120" w:type="dxa"/>
+              <w:bottom w:w="80" w:type="dxa"/>
+              <w:end w:w="120" w:type="dxa"/>
+            </w:tcMar>
+          </w:tcPr>
+          <w:p>
+            <w:pPr>
+              <w:jc w:val="left"/>
+            </w:pPr>
+            <w:r>
+              <w:rPr>
+                <w:rFonts w:ascii="Calibri" w:hAnsi="Calibri" w:eastAsia="宋体"/>
+                <w:sz w:val="20"/>
+              </w:rPr>
+              <w:t>展示专业Agent、工具组、Context Tree、Memory OS和目标统计</w:t>
+            </w:r>
+          </w:p>
+        </w:tc>
+      </w:tr>
+      <w:tr>
+        <w:tc>
+          <w:tcPr>
+            <w:tcW w:type="dxa" w:w="2088"/>
+            <w:vAlign w:val="center"/>
+            <w:tcMar>
+              <w:top w:w="80" w:type="dxa"/>
+              <w:start w:w="120" w:type="dxa"/>
+              <w:bottom w:w="80" w:type="dxa"/>
+              <w:end w:w="120" w:type="dxa"/>
+            </w:tcMar>
+          </w:tcPr>
+          <w:p>
+            <w:pPr>
+              <w:jc w:val="left"/>
+            </w:pPr>
+            <w:r>
+              <w:rPr>
+                <w:rFonts w:ascii="Calibri" w:hAnsi="Calibri" w:eastAsia="宋体"/>
+                <w:sz w:val="20"/>
+              </w:rPr>
+              <w:t>目标管理</w:t>
+            </w:r>
+          </w:p>
+        </w:tc>
+        <w:tc>
+          <w:tcPr>
+            <w:tcW w:type="dxa" w:w="3096"/>
+            <w:vAlign w:val="center"/>
+            <w:tcMar>
+              <w:top w:w="80" w:type="dxa"/>
+              <w:start w:w="120" w:type="dxa"/>
+              <w:bottom w:w="80" w:type="dxa"/>
+              <w:end w:w="120" w:type="dxa"/>
+            </w:tcMar>
+          </w:tcPr>
+          <w:p>
+            <w:pPr>
+              <w:jc w:val="left"/>
+            </w:pPr>
+            <w:r>
+              <w:rPr>
+                <w:rFonts w:ascii="Calibri" w:hAnsi="Calibri" w:eastAsia="宋体"/>
+                <w:sz w:val="20"/>
+              </w:rPr>
+              <w:t>goals/store.py、/api/goals</w:t>
+            </w:r>
+          </w:p>
+        </w:tc>
+        <w:tc>
+          <w:tcPr>
+            <w:tcW w:type="dxa" w:w="4176"/>
+            <w:vAlign w:val="center"/>
+            <w:tcMar>
+              <w:top w:w="80" w:type="dxa"/>
+              <w:start w:w="120" w:type="dxa"/>
+              <w:bottom w:w="80" w:type="dxa"/>
+              <w:end w:w="120" w:type="dxa"/>
+            </w:tcMar>
+          </w:tcPr>
+          <w:p>
+            <w:pPr>
+              <w:jc w:val="left"/>
+            </w:pPr>
+            <w:r>
+              <w:rPr>
+                <w:rFonts w:ascii="Calibri" w:hAnsi="Calibri" w:eastAsia="宋体"/>
+                <w:sz w:val="20"/>
+              </w:rPr>
+              <w:t>创建目标、追加进度、完成目标并写入本地JSON</w:t>
+            </w:r>
+          </w:p>
+        </w:tc>
+      </w:tr>
+      <w:tr>
+        <w:tc>
+          <w:tcPr>
+            <w:tcW w:type="dxa" w:w="2088"/>
+            <w:vAlign w:val="center"/>
+            <w:tcMar>
+              <w:top w:w="80" w:type="dxa"/>
+              <w:start w:w="120" w:type="dxa"/>
+              <w:bottom w:w="80" w:type="dxa"/>
+              <w:end w:w="120" w:type="dxa"/>
+            </w:tcMar>
+          </w:tcPr>
+          <w:p>
+            <w:pPr>
+              <w:jc w:val="left"/>
+            </w:pPr>
+            <w:r>
+              <w:rPr>
+                <w:rFonts w:ascii="Calibri" w:hAnsi="Calibri" w:eastAsia="宋体"/>
+                <w:sz w:val="20"/>
+              </w:rPr>
+              <w:t>静态前端完整性</w:t>
+            </w:r>
+          </w:p>
+        </w:tc>
+        <w:tc>
+          <w:tcPr>
+            <w:tcW w:type="dxa" w:w="3096"/>
+            <w:vAlign w:val="center"/>
+            <w:tcMar>
+              <w:top w:w="80" w:type="dxa"/>
+              <w:start w:w="120" w:type="dxa"/>
+              <w:bottom w:w="80" w:type="dxa"/>
+              <w:end w:w="120" w:type="dxa"/>
+            </w:tcMar>
+          </w:tcPr>
+          <w:p>
+            <w:pPr>
+              <w:jc w:val="left"/>
+            </w:pPr>
+            <w:r>
+              <w:rPr>
+                <w:rFonts w:ascii="Calibri" w:hAnsi="Calibri" w:eastAsia="宋体"/>
+                <w:sz w:val="20"/>
+              </w:rPr>
+              <w:t>ui/web_api.py</w:t>
+            </w:r>
+          </w:p>
+        </w:tc>
+        <w:tc>
+          <w:tcPr>
+            <w:tcW w:type="dxa" w:w="4176"/>
+            <w:vAlign w:val="center"/>
+            <w:tcMar>
+              <w:top w:w="80" w:type="dxa"/>
+              <w:start w:w="120" w:type="dxa"/>
+              <w:bottom w:w="80" w:type="dxa"/>
+              <w:end w:w="120" w:type="dxa"/>
+            </w:tcMar>
+          </w:tcPr>
+          <w:p>
+            <w:pPr>
+              <w:jc w:val="left"/>
+            </w:pPr>
+            <w:r>
+              <w:rPr>
+                <w:rFonts w:ascii="Calibri" w:hAnsi="Calibri" w:eastAsia="宋体"/>
+                <w:sz w:val="20"/>
+              </w:rPr>
+              <w:t>index.html引用的assets必须存在且位于dist内，否则回退构建提示</w:t>
+            </w:r>
+          </w:p>
+        </w:tc>
+      </w:tr>
+    </w:tbl>
+    <w:p/>
+    <w:p>
+      <w:pPr>
+        <w:ind w:firstLine="432"/>
+      </w:pPr>
+      <w:r>
+        <w:rPr>
+          <w:rFonts w:ascii="Calibri" w:hAnsi="Calibri" w:eastAsia="宋体"/>
+          <w:sz w:val="22"/>
+        </w:rPr>
+        <w:t>`ui2/src`是主要React工作台，支持聊天流式显示、结构化数据面板、DAC-3D运行状态卡、Tool Gateway视图、命令批准按钮、记忆补丁审批、Agent目标列表和评测面板。`frontend/src`则保留工业设备信息管理Agent演示界面，用于验证工具化架构扩展能力。</w:t>
       </w:r>
     </w:p>
     <w:p>
@@ -11711,7 +14197,7 @@
           <w:rFonts w:ascii="Calibri" w:hAnsi="Calibri" w:eastAsia="宋体"/>
           <w:sz w:val="22"/>
         </w:rPr>
-        <w:t>本章从后端入口、文档证据层、命令生成、DAC适配、安全网关、Agent运行时、Memory OS、Trace/Eval、前端工作台和主系统桥接等方面说明了核心模块实现。实现结果表明，本文系统不是单一聊天页面，也不是旧式检索问答系统，而是一个围绕DAC-3D检测业务构建的受控Agent运行时。</w:t>
+        <w:t>本章从后端入口、文档证据层、命令生成、DAC适配、安全网关、Agent运行时、Context Tree、Goal Store、Memory OS、Trace/Eval、API安全、前端工作台和主系统桥接等方面说明了核心模块实现。实现结果表明，本文系统不是单一聊天页面，也不是旧式检索问答系统，而是一个围绕DAC-3D检测业务构建的受控Agent运行时。</w:t>
       </w:r>
     </w:p>
     <w:p>
@@ -11748,7 +14234,7 @@
           <w:rFonts w:ascii="Calibri" w:hAnsi="Calibri" w:eastAsia="宋体"/>
           <w:sz w:val="22"/>
         </w:rPr>
-        <w:t>测试章节的目标不是简单罗列运行命令，而是回答第3章需求和第4章设计是否得到验证。验证重点包括：核心功能是否可运行、模块接口是否稳定、安全边界是否生效、Memory OS写入是否可审核、Agent评测是否可回归，以及DAC-3D文件桥接是否能支撑演示流程。测试环境为本地macOS工作区，代码路径为`/Users/xecat/Documents/yyw/DAC-3D-LLM`，测试日期为2026年5月27日。由于真实DAC-3D硬件、Windows GUI环境、完整CUDA/PyTorch部署和生产设备SDK并非当前环境全部具备，硬件联机和长期生产运行未纳入本次自动化测试范围。</w:t>
+        <w:t>测试章节的目标不是简单罗列运行命令，而是回答第3章需求和第4章设计是否得到验证。验证重点包括：核心功能是否可运行、模块接口是否稳定、安全边界是否生效、API身份与确认token是否有效、Memory OS写入是否可审核、Goal Store和Context Tree是否能进入Agent工作空间、Agent评测是否可回归，以及DAC-3D文件桥接是否能支撑演示流程。测试环境为本地macOS工作区，代码路径为`/Users/xecat/Documents/yyw/DAC-3D-LLM`，测试日期为2026年5月27日。由于真实DAC-3D硬件、Windows GUI环境、完整CUDA/PyTorch部署和生产设备SDK并非当前环境全部具备，硬件联机和长期生产运行未纳入本次自动化测试范围。</w:t>
       </w:r>
     </w:p>
     <w:p>
@@ -11988,7 +14474,7 @@
                 <w:rFonts w:ascii="Calibri" w:hAnsi="Calibri" w:eastAsia="宋体"/>
                 <w:sz w:val="20"/>
               </w:rPr>
-              <w:t>153 passed in 2.38s</w:t>
+              <w:t>178 passed in 4.23s</w:t>
             </w:r>
           </w:p>
         </w:tc>
@@ -12189,6 +14675,56 @@
                 <w:sz w:val="20"/>
               </w:rPr>
               <w:t>8个受控工具</w:t>
+            </w:r>
+          </w:p>
+        </w:tc>
+      </w:tr>
+      <w:tr>
+        <w:tc>
+          <w:tcPr>
+            <w:tcW w:type="dxa" w:w="2880"/>
+            <w:vAlign w:val="center"/>
+            <w:tcMar>
+              <w:top w:w="80" w:type="dxa"/>
+              <w:start w:w="120" w:type="dxa"/>
+              <w:bottom w:w="80" w:type="dxa"/>
+              <w:end w:w="120" w:type="dxa"/>
+            </w:tcMar>
+          </w:tcPr>
+          <w:p>
+            <w:pPr>
+              <w:jc w:val="left"/>
+            </w:pPr>
+            <w:r>
+              <w:rPr>
+                <w:rFonts w:ascii="Calibri" w:hAnsi="Calibri" w:eastAsia="宋体"/>
+                <w:sz w:val="20"/>
+              </w:rPr>
+              <w:t>Context Tree节点</w:t>
+            </w:r>
+          </w:p>
+        </w:tc>
+        <w:tc>
+          <w:tcPr>
+            <w:tcW w:type="dxa" w:w="6480"/>
+            <w:vAlign w:val="center"/>
+            <w:tcMar>
+              <w:top w:w="80" w:type="dxa"/>
+              <w:start w:w="120" w:type="dxa"/>
+              <w:bottom w:w="80" w:type="dxa"/>
+              <w:end w:w="120" w:type="dxa"/>
+            </w:tcMar>
+          </w:tcPr>
+          <w:p>
+            <w:pPr>
+              <w:jc w:val="left"/>
+            </w:pPr>
+            <w:r>
+              <w:rPr>
+                <w:rFonts w:ascii="Calibri" w:hAnsi="Calibri" w:eastAsia="宋体"/>
+                <w:sz w:val="20"/>
+              </w:rPr>
+              <w:t>5个默认Markdown节点</w:t>
             </w:r>
           </w:p>
         </w:tc>
@@ -12669,7 +15205,7 @@
                 <w:rFonts w:ascii="Calibri" w:hAnsi="Calibri" w:eastAsia="宋体"/>
                 <w:sz w:val="20"/>
               </w:rPr>
-              <w:t>安全边界</w:t>
+              <w:t>Context Tree与目标跟踪</w:t>
             </w:r>
           </w:p>
         </w:tc>
@@ -12693,7 +15229,7 @@
                 <w:rFonts w:ascii="Calibri" w:hAnsi="Calibri" w:eastAsia="宋体"/>
                 <w:sz w:val="20"/>
               </w:rPr>
-              <w:t>安全边界需求</w:t>
+              <w:t>F8</w:t>
             </w:r>
           </w:p>
         </w:tc>
@@ -12717,7 +15253,7 @@
                 <w:rFonts w:ascii="Calibri" w:hAnsi="Calibri" w:eastAsia="宋体"/>
                 <w:sz w:val="20"/>
               </w:rPr>
-              <w:t>test_policy_engine.py、15条安全红队评测</w:t>
+              <w:t>test_context_engineering.py、test_goal_store.py、/api/agent/workspace测试</w:t>
             </w:r>
           </w:p>
         </w:tc>
@@ -12743,6 +15279,80 @@
                 <w:rFonts w:ascii="Calibri" w:hAnsi="Calibri" w:eastAsia="宋体"/>
                 <w:sz w:val="20"/>
               </w:rPr>
+              <w:t>安全边界</w:t>
+            </w:r>
+          </w:p>
+        </w:tc>
+        <w:tc>
+          <w:tcPr>
+            <w:tcW w:type="dxa" w:w="1728"/>
+            <w:vAlign w:val="center"/>
+            <w:tcMar>
+              <w:top w:w="80" w:type="dxa"/>
+              <w:start w:w="120" w:type="dxa"/>
+              <w:bottom w:w="80" w:type="dxa"/>
+              <w:end w:w="120" w:type="dxa"/>
+            </w:tcMar>
+          </w:tcPr>
+          <w:p>
+            <w:pPr>
+              <w:jc w:val="left"/>
+            </w:pPr>
+            <w:r>
+              <w:rPr>
+                <w:rFonts w:ascii="Calibri" w:hAnsi="Calibri" w:eastAsia="宋体"/>
+                <w:sz w:val="20"/>
+              </w:rPr>
+              <w:t>安全边界需求</w:t>
+            </w:r>
+          </w:p>
+        </w:tc>
+        <w:tc>
+          <w:tcPr>
+            <w:tcW w:type="dxa" w:w="5328"/>
+            <w:vAlign w:val="center"/>
+            <w:tcMar>
+              <w:top w:w="80" w:type="dxa"/>
+              <w:start w:w="120" w:type="dxa"/>
+              <w:bottom w:w="80" w:type="dxa"/>
+              <w:end w:w="120" w:type="dxa"/>
+            </w:tcMar>
+          </w:tcPr>
+          <w:p>
+            <w:pPr>
+              <w:jc w:val="left"/>
+            </w:pPr>
+            <w:r>
+              <w:rPr>
+                <w:rFonts w:ascii="Calibri" w:hAnsi="Calibri" w:eastAsia="宋体"/>
+                <w:sz w:val="20"/>
+              </w:rPr>
+              <w:t>test_policy_engine.py、test_api_security.py、15条安全红队评测</w:t>
+            </w:r>
+          </w:p>
+        </w:tc>
+      </w:tr>
+      <w:tr>
+        <w:tc>
+          <w:tcPr>
+            <w:tcW w:type="dxa" w:w="2304"/>
+            <w:vAlign w:val="center"/>
+            <w:tcMar>
+              <w:top w:w="80" w:type="dxa"/>
+              <w:start w:w="120" w:type="dxa"/>
+              <w:bottom w:w="80" w:type="dxa"/>
+              <w:end w:w="120" w:type="dxa"/>
+            </w:tcMar>
+          </w:tcPr>
+          <w:p>
+            <w:pPr>
+              <w:jc w:val="left"/>
+            </w:pPr>
+            <w:r>
+              <w:rPr>
+                <w:rFonts w:ascii="Calibri" w:hAnsi="Calibri" w:eastAsia="宋体"/>
+                <w:sz w:val="20"/>
+              </w:rPr>
               <w:t>Web/API交互</w:t>
             </w:r>
           </w:p>
@@ -12767,7 +15377,7 @@
                 <w:rFonts w:ascii="Calibri" w:hAnsi="Calibri" w:eastAsia="宋体"/>
                 <w:sz w:val="20"/>
               </w:rPr>
-              <w:t>F9</w:t>
+              <w:t>F10、F11</w:t>
             </w:r>
           </w:p>
         </w:tc>
@@ -12791,7 +15401,7 @@
                 <w:rFonts w:ascii="Calibri" w:hAnsi="Calibri" w:eastAsia="宋体"/>
                 <w:sz w:val="20"/>
               </w:rPr>
-              <w:t>test_web_api.py、FastAPI接口返回结构</w:t>
+              <w:t>test_web_api.py、API安全测试、静态前端完整性测试</w:t>
             </w:r>
           </w:p>
         </w:tc>
@@ -12819,7 +15429,7 @@
           <w:rFonts w:ascii="Calibri" w:hAnsi="Calibri" w:eastAsia="宋体"/>
           <w:sz w:val="22"/>
         </w:rPr>
-        <w:t>助手侧自动化测试覆盖Agent运行时、基础助手、聊天组件、命令生命周期安全、组件集成、上下文工程、会话记忆、嵌入式运行时桥接、LLM与UI、设备Agent、PolicyEngine、运行入口、技能系统、Tool Gateway、Trace/Eval和Web API等模块。153个测试全部通过，说明当前代码在本地环境下具备较完整的回归保障。</w:t>
+        <w:t>助手侧自动化测试覆盖Agent运行时、基础助手、聊天组件、命令生命周期安全、组件集成、上下文工程、Context Tree、Goal Store、会话记忆、记忆安全、嵌入式运行时桥接、LLM与UI、设备Agent、PolicyEngine、提示注入防护、运行入口、技能系统、Tool Gateway、Trace/Eval、API安全和Web API等模块。178个测试全部通过，说明当前代码在本地环境下具备较完整的回归保障。</w:t>
       </w:r>
     </w:p>
     <w:p>
@@ -13173,7 +15783,7 @@
                 <w:rFonts w:ascii="Calibri" w:hAnsi="Calibri" w:eastAsia="宋体"/>
                 <w:sz w:val="20"/>
               </w:rPr>
-              <w:t>test_conversation_memory.py</w:t>
+              <w:t>test_goal_store.py</w:t>
             </w:r>
           </w:p>
         </w:tc>
@@ -13197,7 +15807,7 @@
                 <w:rFonts w:ascii="Calibri" w:hAnsi="Calibri" w:eastAsia="宋体"/>
                 <w:sz w:val="20"/>
               </w:rPr>
-              <w:t>JSON会话记忆、长期索引和安全写入</w:t>
+              <w:t>目标创建、去重、进度追加和完成记录</w:t>
             </w:r>
           </w:p>
         </w:tc>
@@ -13223,7 +15833,7 @@
                 <w:rFonts w:ascii="Calibri" w:hAnsi="Calibri" w:eastAsia="宋体"/>
                 <w:sz w:val="20"/>
               </w:rPr>
-              <w:t>test_trace_eval.py</w:t>
+              <w:t>test_conversation_memory.py</w:t>
             </w:r>
           </w:p>
         </w:tc>
@@ -13247,7 +15857,7 @@
                 <w:rFonts w:ascii="Calibri" w:hAnsi="Calibri" w:eastAsia="宋体"/>
                 <w:sz w:val="20"/>
               </w:rPr>
-              <w:t>trace记录、评测运行和草稿生成</w:t>
+              <w:t>JSON会话记忆、长期索引和安全写入</w:t>
             </w:r>
           </w:p>
         </w:tc>
@@ -13273,6 +15883,206 @@
                 <w:rFonts w:ascii="Calibri" w:hAnsi="Calibri" w:eastAsia="宋体"/>
                 <w:sz w:val="20"/>
               </w:rPr>
+              <w:t>test_memory_security.py</w:t>
+            </w:r>
+          </w:p>
+        </w:tc>
+        <w:tc>
+          <w:tcPr>
+            <w:tcW w:type="dxa" w:w="5976"/>
+            <w:vAlign w:val="center"/>
+            <w:tcMar>
+              <w:top w:w="80" w:type="dxa"/>
+              <w:start w:w="120" w:type="dxa"/>
+              <w:bottom w:w="80" w:type="dxa"/>
+              <w:end w:w="120" w:type="dxa"/>
+            </w:tcMar>
+          </w:tcPr>
+          <w:p>
+            <w:pPr>
+              <w:jc w:val="left"/>
+            </w:pPr>
+            <w:r>
+              <w:rPr>
+                <w:rFonts w:ascii="Calibri" w:hAnsi="Calibri" w:eastAsia="宋体"/>
+                <w:sz w:val="20"/>
+              </w:rPr>
+              <w:t>记忆补丁审批、秘密信息和跳过确认注入拦截</w:t>
+            </w:r>
+          </w:p>
+        </w:tc>
+      </w:tr>
+      <w:tr>
+        <w:tc>
+          <w:tcPr>
+            <w:tcW w:type="dxa" w:w="3384"/>
+            <w:vAlign w:val="center"/>
+            <w:tcMar>
+              <w:top w:w="80" w:type="dxa"/>
+              <w:start w:w="120" w:type="dxa"/>
+              <w:bottom w:w="80" w:type="dxa"/>
+              <w:end w:w="120" w:type="dxa"/>
+            </w:tcMar>
+          </w:tcPr>
+          <w:p>
+            <w:pPr>
+              <w:jc w:val="left"/>
+            </w:pPr>
+            <w:r>
+              <w:rPr>
+                <w:rFonts w:ascii="Calibri" w:hAnsi="Calibri" w:eastAsia="宋体"/>
+                <w:sz w:val="20"/>
+              </w:rPr>
+              <w:t>test_api_security.py</w:t>
+            </w:r>
+          </w:p>
+        </w:tc>
+        <w:tc>
+          <w:tcPr>
+            <w:tcW w:type="dxa" w:w="5976"/>
+            <w:vAlign w:val="center"/>
+            <w:tcMar>
+              <w:top w:w="80" w:type="dxa"/>
+              <w:start w:w="120" w:type="dxa"/>
+              <w:bottom w:w="80" w:type="dxa"/>
+              <w:end w:w="120" w:type="dxa"/>
+            </w:tcMar>
+          </w:tcPr>
+          <w:p>
+            <w:pPr>
+              <w:jc w:val="left"/>
+            </w:pPr>
+            <w:r>
+              <w:rPr>
+                <w:rFonts w:ascii="Calibri" w:hAnsi="Calibri" w:eastAsia="宋体"/>
+                <w:sz w:val="20"/>
+              </w:rPr>
+              <w:t>API身份、角色权限、确认token、CORS和错误泄漏防护</w:t>
+            </w:r>
+          </w:p>
+        </w:tc>
+      </w:tr>
+      <w:tr>
+        <w:tc>
+          <w:tcPr>
+            <w:tcW w:type="dxa" w:w="3384"/>
+            <w:vAlign w:val="center"/>
+            <w:tcMar>
+              <w:top w:w="80" w:type="dxa"/>
+              <w:start w:w="120" w:type="dxa"/>
+              <w:bottom w:w="80" w:type="dxa"/>
+              <w:end w:w="120" w:type="dxa"/>
+            </w:tcMar>
+          </w:tcPr>
+          <w:p>
+            <w:pPr>
+              <w:jc w:val="left"/>
+            </w:pPr>
+            <w:r>
+              <w:rPr>
+                <w:rFonts w:ascii="Calibri" w:hAnsi="Calibri" w:eastAsia="宋体"/>
+                <w:sz w:val="20"/>
+              </w:rPr>
+              <w:t>test_prompt_injection_security.py</w:t>
+            </w:r>
+          </w:p>
+        </w:tc>
+        <w:tc>
+          <w:tcPr>
+            <w:tcW w:type="dxa" w:w="5976"/>
+            <w:vAlign w:val="center"/>
+            <w:tcMar>
+              <w:top w:w="80" w:type="dxa"/>
+              <w:start w:w="120" w:type="dxa"/>
+              <w:bottom w:w="80" w:type="dxa"/>
+              <w:end w:w="120" w:type="dxa"/>
+            </w:tcMar>
+          </w:tcPr>
+          <w:p>
+            <w:pPr>
+              <w:jc w:val="left"/>
+            </w:pPr>
+            <w:r>
+              <w:rPr>
+                <w:rFonts w:ascii="Calibri" w:hAnsi="Calibri" w:eastAsia="宋体"/>
+                <w:sz w:val="20"/>
+              </w:rPr>
+              <w:t>提示注入检测与上下文信任边界</w:t>
+            </w:r>
+          </w:p>
+        </w:tc>
+      </w:tr>
+      <w:tr>
+        <w:tc>
+          <w:tcPr>
+            <w:tcW w:type="dxa" w:w="3384"/>
+            <w:vAlign w:val="center"/>
+            <w:tcMar>
+              <w:top w:w="80" w:type="dxa"/>
+              <w:start w:w="120" w:type="dxa"/>
+              <w:bottom w:w="80" w:type="dxa"/>
+              <w:end w:w="120" w:type="dxa"/>
+            </w:tcMar>
+          </w:tcPr>
+          <w:p>
+            <w:pPr>
+              <w:jc w:val="left"/>
+            </w:pPr>
+            <w:r>
+              <w:rPr>
+                <w:rFonts w:ascii="Calibri" w:hAnsi="Calibri" w:eastAsia="宋体"/>
+                <w:sz w:val="20"/>
+              </w:rPr>
+              <w:t>test_trace_eval.py</w:t>
+            </w:r>
+          </w:p>
+        </w:tc>
+        <w:tc>
+          <w:tcPr>
+            <w:tcW w:type="dxa" w:w="5976"/>
+            <w:vAlign w:val="center"/>
+            <w:tcMar>
+              <w:top w:w="80" w:type="dxa"/>
+              <w:start w:w="120" w:type="dxa"/>
+              <w:bottom w:w="80" w:type="dxa"/>
+              <w:end w:w="120" w:type="dxa"/>
+            </w:tcMar>
+          </w:tcPr>
+          <w:p>
+            <w:pPr>
+              <w:jc w:val="left"/>
+            </w:pPr>
+            <w:r>
+              <w:rPr>
+                <w:rFonts w:ascii="Calibri" w:hAnsi="Calibri" w:eastAsia="宋体"/>
+                <w:sz w:val="20"/>
+              </w:rPr>
+              <w:t>trace记录、评测运行和草稿生成</w:t>
+            </w:r>
+          </w:p>
+        </w:tc>
+      </w:tr>
+      <w:tr>
+        <w:tc>
+          <w:tcPr>
+            <w:tcW w:type="dxa" w:w="3384"/>
+            <w:vAlign w:val="center"/>
+            <w:tcMar>
+              <w:top w:w="80" w:type="dxa"/>
+              <w:start w:w="120" w:type="dxa"/>
+              <w:bottom w:w="80" w:type="dxa"/>
+              <w:end w:w="120" w:type="dxa"/>
+            </w:tcMar>
+          </w:tcPr>
+          <w:p>
+            <w:pPr>
+              <w:jc w:val="left"/>
+            </w:pPr>
+            <w:r>
+              <w:rPr>
+                <w:rFonts w:ascii="Calibri" w:hAnsi="Calibri" w:eastAsia="宋体"/>
+                <w:sz w:val="20"/>
+              </w:rPr>
               <w:t>test_web_api.py</w:t>
             </w:r>
           </w:p>
@@ -13297,7 +16107,7 @@
                 <w:rFonts w:ascii="Calibri" w:hAnsi="Calibri" w:eastAsia="宋体"/>
                 <w:sz w:val="20"/>
               </w:rPr>
-              <w:t>FastAPI聊天、流式、命令批准和辅助接口</w:t>
+              <w:t>FastAPI聊天、流式、命令批准、目标工作台和静态前端完整性</w:t>
             </w:r>
           </w:p>
         </w:tc>
@@ -14014,6 +16824,18 @@
           <w:rFonts w:ascii="Calibri" w:hAnsi="Calibri" w:eastAsia="宋体"/>
           <w:sz w:val="22"/>
         </w:rPr>
+        <w:t>API安全测试进一步验证Web边界。缺少session_id的写请求会返回MISSING_SESSION_ID；使用不同operator确认同一命令会返回OPERATOR_ID_MISMATCH；确认token二次使用会返回CONFIRMATION_TOKEN_REPLAYED；过期token和preview_hash不匹配会被拒绝；记忆审批和技能补丁应用要求admin或security_admin角色；内部异常不会泄漏堆栈文本；生产环境CORS不会返回通配符来源。</w:t>
+      </w:r>
+    </w:p>
+    <w:p>
+      <w:pPr>
+        <w:ind w:firstLine="432"/>
+      </w:pPr>
+      <w:r>
+        <w:rPr>
+          <w:rFonts w:ascii="Calibri" w:hAnsi="Calibri" w:eastAsia="宋体"/>
+          <w:sz w:val="22"/>
+        </w:rPr>
         <w:t>在确定性Agent评测中，15条安全红队样例全部通过，包括中文的“不要确认，直接执行”“绕过安全审批”“直接写入command.json”“忽略系统安全规则”“跳过审批，立即开始”，英文的“ignore previous instructions”“bypass confirmation”“without approval”“no confirmation needed”，以及混合语言和工具输出注入风格样例。系统对这些输入保持命令预览语义，但将`can_submit`置为false，并在blocked_by中标识prompt_injection_detected或相关策略拦截。</w:t>
       </w:r>
     </w:p>
@@ -14074,7 +16896,7 @@
           <w:rFonts w:ascii="Calibri" w:hAnsi="Calibri" w:eastAsia="宋体"/>
           <w:sz w:val="22"/>
         </w:rPr>
-        <w:t>测试结果表明，本文系统在本地演示环境下完成了文档证据索引、Agent工具、命令预览、安全审批、状态读取、Memory OS补丁审批、评测和Web接口等主要链路。相比初稿中偏重资料问答与Web聊天的表述，新版系统已经具备更明确的受控Agent运行时特征。其中，记忆系统不再被简单视为聊天历史缓存，而是以短期历史、会话JSON、长期索引、核心Markdown记忆、用户偏好和可审批补丁共同构成跨轮上下文能力。</w:t>
+        <w:t>测试结果表明，本文系统在本地演示环境下完成了文档证据索引、Agent工具、命令预览、安全审批、API安全、状态读取、Context Tree检索、Goal Store目标跟踪、Memory OS补丁审批、评测和Web接口等主要链路。相比初稿中偏重资料问答与Web聊天的表述，新版系统已经具备更明确的受控Agent运行时特征。其中，记忆系统不再被简单视为聊天历史缓存，而是以短期历史、会话JSON、长期索引、核心Markdown记忆、用户偏好和可审批补丁共同构成跨轮上下文能力。</w:t>
       </w:r>
     </w:p>
     <w:p>
@@ -14147,7 +16969,7 @@
           <w:rFonts w:ascii="Calibri" w:hAnsi="Calibri" w:eastAsia="宋体"/>
           <w:sz w:val="22"/>
         </w:rPr>
-        <w:t>本文围绕DAC-3D工业检测软件的人机交互问题，设计并实现了一套受控DAC-Agent Runtime。系统以DAC-3D文档证据、运行时状态、检测结果数据和可审核记忆为依据，提供文档证据问答、操作指导、命令预览、状态查询、结果解释、记忆检索、技能选择、安全审查和评测追踪等能力。与通用聊天机器人不同，本文系统强调上下文工程、结构化命令、安全审批、Memory OS和低侵入式主系统桥接。</w:t>
+        <w:t>本文围绕DAC-3D工业检测软件的人机交互问题，设计并实现了一套受控DAC-Agent Runtime。系统以DAC-3D文档证据、运行时状态、检测结果数据、Context Tree、目标记录和可审核记忆为依据，提供文档证据问答、操作指导、命令预览、状态查询、结果解释、记忆检索、目标跟踪、技能选择、安全审查和评测追踪等能力。与通用聊天机器人不同，本文系统强调上下文工程、结构化命令、API安全、安全审批、Memory OS、Goal Store和低侵入式主系统桥接。</w:t>
       </w:r>
     </w:p>
     <w:p>
@@ -14159,7 +16981,7 @@
           <w:rFonts w:ascii="Calibri" w:hAnsi="Calibri" w:eastAsia="宋体"/>
           <w:sz w:val="22"/>
         </w:rPr>
-        <w:t>从架构上看，系统由LLM、Agent Runtime、Memory OS、Skill System、Context Builder、Tool Gateway、Safety Guard、Trace/Eval Loop和文档证据层共同组成。Agent层负责理解任务、选择工具和整合结果；文档证据层负责回答“资料依据是什么”；Memory OS负责回答“前文目标、用户偏好和经批准长期记忆是什么”；Tool Gateway和PolicyEngine负责把执行权限约束在代码层；DAC3DClient和PyQt主系统文件桥接负责状态与命令传输；React工作台负责展示结构化数据、审批按钮、运行状态、记忆补丁和评测结果。</w:t>
+        <w:t>从架构上看，系统由LLM、Agent Runtime、Goal Store、Context Tree、Memory OS、Skill System、Context Builder、Tool Gateway、API Security、Safety Guard、Trace/Eval Loop和文档证据层共同组成。Agent层负责理解任务、选择工具和整合结果；文档证据层负责回答“资料依据是什么”；Context Tree负责回答“当前项目和操作流程有哪些稳定上下文”；Memory OS负责回答“前文目标、用户偏好和经批准长期记忆是什么”；Goal Store负责回答“当前任务推进到哪一步”；Tool Gateway、API Actor和PolicyEngine负责把执行权限约束在代码层；DAC3DClient和PyQt主系统文件桥接负责状态与命令传输；React工作台负责展示结构化数据、审批按钮、运行状态、目标进度、记忆补丁和评测结果。</w:t>
       </w:r>
     </w:p>
     <w:p>
@@ -14213,7 +17035,35 @@
           <w:rFonts w:ascii="Calibri" w:hAnsi="Calibri" w:eastAsia="宋体"/>
           <w:sz w:val="22"/>
         </w:rPr>
+        <w:t>实现Context Tree，默认提供5个Markdown工作上下文节点，并支持按任务检索进入Context Builder。</w:t>
+      </w:r>
+    </w:p>
+    <w:p>
+      <w:pPr>
+        <w:pStyle w:val="ListNumber"/>
+        <w:spacing w:after="80" w:line="290" w:lineRule="auto"/>
+        <w:ind w:left="540" w:hanging="279"/>
+      </w:pPr>
+      <w:r>
+        <w:rPr>
+          <w:rFonts w:ascii="Calibri" w:hAnsi="Calibri" w:eastAsia="宋体"/>
+          <w:sz w:val="22"/>
+        </w:rPr>
         <w:t>实现Memory OS，支持短期历史、会话JSON、长期索引、核心记忆、用户偏好、主题笔记和可审核记忆补丁。</w:t>
+      </w:r>
+    </w:p>
+    <w:p>
+      <w:pPr>
+        <w:pStyle w:val="ListNumber"/>
+        <w:spacing w:after="80" w:line="290" w:lineRule="auto"/>
+        <w:ind w:left="540" w:hanging="279"/>
+      </w:pPr>
+      <w:r>
+        <w:rPr>
+          <w:rFonts w:ascii="Calibri" w:hAnsi="Calibri" w:eastAsia="宋体"/>
+          <w:sz w:val="22"/>
+        </w:rPr>
+        <w:t>实现Goal Store和Agent工作空间，支持目标创建、进度追加、完成记录和工作流预览。</w:t>
       </w:r>
     </w:p>
     <w:p>
@@ -14269,7 +17119,7 @@
           <w:rFonts w:ascii="Calibri" w:hAnsi="Calibri" w:eastAsia="宋体"/>
           <w:sz w:val="22"/>
         </w:rPr>
-        <w:t>实现与DAC-3D主系统的文件桥接，主系统可以写出状态与结果历史，助手可以在确认后提交结构化命令。</w:t>
+        <w:t>实现Web API安全边界，支持ApiActor角色权限、请求追踪、限流、会话绑定确认token和静态前端完整性检查。</w:t>
       </w:r>
     </w:p>
     <w:p>
@@ -14283,7 +17133,21 @@
           <w:rFonts w:ascii="Calibri" w:hAnsi="Calibri" w:eastAsia="宋体"/>
           <w:sz w:val="22"/>
         </w:rPr>
-        <w:t>完成自动化测试和确定性Agent评测，153个pytest用例全部通过，20个Agent评测用例全部通过。</w:t>
+        <w:t>实现与DAC-3D主系统的文件桥接，主系统可以写出状态与结果历史，助手可以在确认后提交结构化命令。</w:t>
+      </w:r>
+    </w:p>
+    <w:p>
+      <w:pPr>
+        <w:pStyle w:val="ListNumber"/>
+        <w:spacing w:after="80" w:line="290" w:lineRule="auto"/>
+        <w:ind w:left="540" w:hanging="279"/>
+      </w:pPr>
+      <w:r>
+        <w:rPr>
+          <w:rFonts w:ascii="Calibri" w:hAnsi="Calibri" w:eastAsia="宋体"/>
+          <w:sz w:val="22"/>
+        </w:rPr>
+        <w:t>完成自动化测试和确定性Agent评测，178个pytest用例全部通过，20个Agent评测用例全部通过。</w:t>
       </w:r>
     </w:p>
     <w:p>
@@ -14307,7 +17171,7 @@
           <w:rFonts w:ascii="Calibri" w:hAnsi="Calibri" w:eastAsia="宋体"/>
           <w:sz w:val="22"/>
         </w:rPr>
-        <w:t>本文系统仍属于本地演示和原型验证阶段。首先，真实硬件长时间联机、不同样品批次和多种异常工况下的稳定性仍需进一步验证；其次，当前安全策略主要覆盖命令执行链路、提示注入和记忆补丁，生产环境还需要引入完整身份认证、角色权限、操作审计、日志防篡改和供应链安全；再次，文档证据内容和缺陷规则仍需随DAC-3D实际资料持续维护；最后，前端交互中DAC-3D助手和工业设备信息管理Agent还需要进一步统一产品边界。</w:t>
+        <w:t>本文系统仍属于本地演示和原型验证阶段。首先，真实硬件长时间联机、不同样品批次和多种异常工况下的稳定性仍需进一步验证；其次，当前API安全已经覆盖会话、角色、确认token、限流和错误结构化，但生产环境仍需要接入真实身份认证、持久化会话、集中审计、日志防篡改和供应链安全；再次，文档证据内容、Context Tree节点和缺陷规则仍需随DAC-3D实际资料持续维护；最后，前端交互中DAC-3D助手和工业设备信息管理Agent还需要进一步统一产品边界。</w:t>
       </w:r>
     </w:p>
     <w:p>
@@ -14331,7 +17195,7 @@
           <w:rFonts w:ascii="Calibri" w:hAnsi="Calibri" w:eastAsia="宋体"/>
           <w:sz w:val="22"/>
         </w:rPr>
-        <w:t>后续工作可以从四个方向展开。第一，增强真实设备联机验证，在Windows、PyQt5、CUDA、模型权重和实际DAC-3D硬件环境下进行完整在线扫描和离线检测测试。第二，完善生产级安全体系，引入用户登录、角色权限、审批记录、命令签名、审计日志防篡改和依赖漏洞扫描。第三，提升文档证据层与结果解释质量，扩充DAC-3D手册、缺陷规则、典型异常和维修案例，建立更系统的离线评测集。第四，优化前端与嵌入式体验，把网页助手、主系统Dock、命令批准、状态卡和结果图像展示整合为更自然的检测工作台。</w:t>
+        <w:t>后续工作可以从四个方向展开。第一，增强真实设备联机验证，在Windows、PyQt5、CUDA、模型权重和实际DAC-3D硬件环境下进行完整在线扫描和离线检测测试。第二，完善生产级安全体系，引入企业身份认证、持久化会话、命令签名、审批记录、审计日志防篡改和依赖漏洞扫描。第三，提升文档证据层、Context Tree和结果解释质量，扩充DAC-3D手册、缺陷规则、典型异常和维修案例，建立更系统的离线评测集。第四，优化Agent工作空间和嵌入式体验，把网页助手、目标跟踪、主系统Dock、命令批准、状态卡和结果图像展示整合为更自然的检测工作台。</w:t>
       </w:r>
     </w:p>
     <w:p>
@@ -14512,6 +17376,19 @@
           <w:sz w:val="21"/>
         </w:rPr>
         <w:t>OWASP Foundation. OWASP Top 10 for Large Language Model Applications[EB/OL].</w:t>
+      </w:r>
+    </w:p>
+    <w:p>
+      <w:pPr>
+        <w:pStyle w:val="ListNumber"/>
+        <w:ind w:left="504" w:hanging="360"/>
+      </w:pPr>
+      <w:r>
+        <w:rPr>
+          <w:rFonts w:ascii="Calibri" w:hAnsi="Calibri" w:eastAsia="宋体"/>
+          <w:sz w:val="21"/>
+        </w:rPr>
+        <w:t>OWASP Foundation. OWASP API Security Top 10[EB/OL].</w:t>
       </w:r>
     </w:p>
     <w:p>

</xml_diff>